<commit_message>
Minor modifications to user help and manual
Clarify use of wet (bulk) density and dry density for model input parameters
</commit_message>
<xml_diff>
--- a/app/doc/ASMITA manual_v35.docx
+++ b/app/doc/ASMITA manual_v35.docx
@@ -8378,7 +8378,7 @@
             <v:imagedata r:id="rId13" o:title=""/>
             <w10:wrap type="topAndBottom" side="left"/>
           </v:shape>
-          <o:OLEObject Type="Embed" ProgID="Visio.Drawing.11" ShapeID="_x0000_s2050" DrawAspect="Content" ObjectID="_1831700719" r:id="rId14"/>
+          <o:OLEObject Type="Embed" ProgID="Visio.Drawing.11" ShapeID="_x0000_s2050" DrawAspect="Content" ObjectID="_1833358137" r:id="rId14"/>
         </w:object>
       </w:r>
       <w:r>
@@ -10200,15 +10200,7 @@
         <w:t>Run&gt;Run model</w:t>
       </w:r>
       <w:r>
-        <w:t xml:space="preserve">: Runs setup check and then runs model. If </w:t>
-      </w:r>
-      <w:proofErr w:type="gramStart"/>
-      <w:r>
-        <w:t>not</w:t>
-      </w:r>
-      <w:proofErr w:type="gramEnd"/>
-      <w:r>
-        <w:t xml:space="preserve"> enough components are defined a warning dialogue is shown and the run aborted. If the model runs the user is prompted for a description of the scenario (model run).</w:t>
+        <w:t>: Runs setup check and then runs model. If not enough components are defined a warning dialogue is shown and the run aborted. If the model runs the user is prompted for a description of the scenario (model run).</w:t>
       </w:r>
     </w:p>
     <w:p>
@@ -10751,7 +10743,7 @@
           <w:noProof/>
         </w:rPr>
         <w:drawing>
-          <wp:anchor distT="0" distB="0" distL="114300" distR="114300" simplePos="0" relativeHeight="251786240" behindDoc="0" locked="0" layoutInCell="1" allowOverlap="1" wp14:anchorId="02DB6950" wp14:editId="443D8877">
+          <wp:anchor distT="0" distB="0" distL="114300" distR="114300" simplePos="0" relativeHeight="251786240" behindDoc="0" locked="0" layoutInCell="1" allowOverlap="1" wp14:anchorId="02DB6950" wp14:editId="24AE180E">
             <wp:simplePos x="0" y="0"/>
             <wp:positionH relativeFrom="column">
               <wp:posOffset>4406265</wp:posOffset>
@@ -11892,15 +11884,7 @@
         <w:t>Setup&gt;Run Parameters&gt;Conditions</w:t>
       </w:r>
       <w:r>
-        <w:t xml:space="preserve">: check flag to ‘Scale to initial </w:t>
-      </w:r>
-      <w:proofErr w:type="gramStart"/>
-      <w:r>
-        <w:t>values’</w:t>
-      </w:r>
-      <w:proofErr w:type="gramEnd"/>
-      <w:r>
-        <w:t>.</w:t>
+        <w:t>: check flag to ‘Scale to initial values’.</w:t>
       </w:r>
     </w:p>
     <w:p>
@@ -12461,17 +12445,8 @@
           <w:i/>
           <w:color w:val="565321" w:themeColor="accent2" w:themeShade="80"/>
         </w:rPr>
-        <w:t>s&gt;</w:t>
-      </w:r>
-      <w:proofErr w:type="gramStart"/>
-      <w:r>
-        <w:rPr>
-          <w:i/>
-          <w:color w:val="565321" w:themeColor="accent2" w:themeShade="80"/>
-        </w:rPr>
-        <w:t>Rivers</w:t>
-      </w:r>
-      <w:proofErr w:type="gramEnd"/>
+        <w:t>s&gt;Rivers</w:t>
+      </w:r>
       <w:r>
         <w:rPr>
           <w:i/>
@@ -12524,15 +12499,7 @@
         <w:t xml:space="preserve">check the flag </w:t>
       </w:r>
       <w:r>
-        <w:t>to ‘</w:t>
-      </w:r>
-      <w:proofErr w:type="gramStart"/>
-      <w:r>
-        <w:t>Include river</w:t>
-      </w:r>
-      <w:proofErr w:type="gramEnd"/>
-      <w:r>
-        <w:t xml:space="preserve"> advection’ and the flag </w:t>
+        <w:t xml:space="preserve">to ‘Include river advection’ and the flag </w:t>
       </w:r>
       <w:r>
         <w:t>for ‘River flow offset’</w:t>
@@ -12931,7 +12898,7 @@
         </w:rPr>
         <w:lastRenderedPageBreak/>
         <w:drawing>
-          <wp:anchor distT="0" distB="0" distL="114300" distR="114300" simplePos="0" relativeHeight="251789312" behindDoc="0" locked="0" layoutInCell="1" allowOverlap="1" wp14:anchorId="2C71BBD5" wp14:editId="64BD10E2">
+          <wp:anchor distT="0" distB="0" distL="114300" distR="114300" simplePos="0" relativeHeight="251789312" behindDoc="0" locked="0" layoutInCell="1" allowOverlap="1" wp14:anchorId="2C71BBD5" wp14:editId="350BE71D">
             <wp:simplePos x="0" y="0"/>
             <wp:positionH relativeFrom="margin">
               <wp:posOffset>4450715</wp:posOffset>
@@ -13311,15 +13278,7 @@
         <w:t>to c</w:t>
       </w:r>
       <w:r>
-        <w:t>heck the flag to ‘</w:t>
-      </w:r>
-      <w:proofErr w:type="gramStart"/>
-      <w:r>
-        <w:t>Include river</w:t>
-      </w:r>
-      <w:proofErr w:type="gramEnd"/>
-      <w:r>
-        <w:t xml:space="preserve"> advection’ and the flag for ‘River flow offset’.</w:t>
+        <w:t>heck the flag to ‘Include river advection’ and the flag for ‘River flow offset’.</w:t>
       </w:r>
     </w:p>
     <w:p>
@@ -14727,7 +14686,7 @@
                 <w:noProof/>
               </w:rPr>
               <w:drawing>
-                <wp:inline distT="0" distB="0" distL="0" distR="0" wp14:anchorId="2A1D5C21" wp14:editId="05D558D2">
+                <wp:inline distT="0" distB="0" distL="0" distR="0" wp14:anchorId="2A1D5C21" wp14:editId="244CE578">
                   <wp:extent cx="3020695" cy="2350770"/>
                   <wp:effectExtent l="0" t="0" r="8255" b="0"/>
                   <wp:docPr id="53" name="Picture 53" descr="Chart, histogram&#10;&#10;Description automatically generated"/>
@@ -15633,21 +15592,7 @@
         <w:rPr>
           <w:iCs/>
         </w:rPr>
-        <w:t>to ‘</w:t>
-      </w:r>
-      <w:proofErr w:type="gramStart"/>
-      <w:r>
-        <w:rPr>
-          <w:iCs/>
-        </w:rPr>
-        <w:t>Include river</w:t>
-      </w:r>
-      <w:proofErr w:type="gramEnd"/>
-      <w:r>
-        <w:rPr>
-          <w:iCs/>
-        </w:rPr>
-        <w:t xml:space="preserve"> advection’ and the </w:t>
+        <w:t xml:space="preserve">to ‘Include river advection’ and the </w:t>
       </w:r>
       <w:r>
         <w:rPr>
@@ -15844,21 +15789,12 @@
       <w:r>
         <w:t xml:space="preserve"> menus that provide access to a number of commonly used functions such as file handling, management of run scenarios, model setup, running and plotting of the results. In addition, Tabs are used to display set-up information of the Cases that have been run. In this manual text in </w:t>
       </w:r>
-      <w:proofErr w:type="gramStart"/>
       <w:r>
         <w:rPr>
           <w:i/>
           <w:color w:val="7B2520" w:themeColor="accent3" w:themeShade="BF"/>
         </w:rPr>
-        <w:t>Red</w:t>
-      </w:r>
-      <w:proofErr w:type="gramEnd"/>
-      <w:r>
-        <w:rPr>
-          <w:i/>
-          <w:color w:val="7B2520" w:themeColor="accent3" w:themeShade="BF"/>
-        </w:rPr>
-        <w:t xml:space="preserve"> italic</w:t>
+        <w:t>Red italic</w:t>
       </w:r>
       <w:r>
         <w:rPr>
@@ -16324,15 +16260,7 @@
         <w:t>The setup menu provides a series of menus to enable different components of the model to be defined.</w:t>
       </w:r>
       <w:r>
-        <w:t xml:space="preserve"> This includes menus for estuary wide parameters, element properties, saltmarsh properties, river and littoral drift advective inputs, interventions, inclusion of </w:t>
-      </w:r>
-      <w:proofErr w:type="gramStart"/>
-      <w:r>
-        <w:t>an</w:t>
-      </w:r>
-      <w:proofErr w:type="gramEnd"/>
-      <w:r>
-        <w:t xml:space="preserve"> hydraulic </w:t>
+        <w:t xml:space="preserve"> This includes menus for estuary wide parameters, element properties, saltmarsh properties, river and littoral drift advective inputs, interventions, inclusion of an hydraulic </w:t>
       </w:r>
       <w:r>
         <w:t>model, and</w:t>
@@ -16379,7 +16307,7 @@
           <w:noProof/>
         </w:rPr>
         <w:drawing>
-          <wp:anchor distT="0" distB="0" distL="114300" distR="114300" simplePos="0" relativeHeight="251791360" behindDoc="0" locked="0" layoutInCell="1" allowOverlap="1" wp14:anchorId="46267971" wp14:editId="4ACBC1C4">
+          <wp:anchor distT="0" distB="0" distL="114300" distR="114300" simplePos="0" relativeHeight="251791360" behindDoc="0" locked="0" layoutInCell="1" allowOverlap="1" wp14:anchorId="46267971" wp14:editId="7B0C5CB1">
             <wp:simplePos x="0" y="0"/>
             <wp:positionH relativeFrom="margin">
               <wp:align>left</wp:align>
@@ -16435,7 +16363,28 @@
         </w:drawing>
       </w:r>
       <w:r>
-        <w:t>Define the concentration that is target or global equilibrium concentration. If included, the fine fraction is used for tidalflats, saltmarsh and storage elements and the coarse fraction for all other element types. When only a single fraction is being considered the fine fraction should be the same as the coarse value, empty or 0.</w:t>
+        <w:t>Define the concentration that is target or global equilibrium concentration</w:t>
+      </w:r>
+      <w:r>
+        <w:t xml:space="preserve"> (defined as a </w:t>
+      </w:r>
+      <w:r>
+        <w:t xml:space="preserve">dry </w:t>
+      </w:r>
+      <w:r>
+        <w:t>density in kg/m</w:t>
+      </w:r>
+      <w:r>
+        <w:rPr>
+          <w:vertAlign w:val="superscript"/>
+        </w:rPr>
+        <w:t>3</w:t>
+      </w:r>
+      <w:r>
+        <w:t>)</w:t>
+      </w:r>
+      <w:r>
+        <w:t>. If included, the fine fraction is used for tidalflats, saltmarsh and storage elements and the coarse fraction for all other element types. When only a single fraction is being considered the fine fraction should be the same as the coarse value, empty or 0.</w:t>
       </w:r>
     </w:p>
     <w:p>
@@ -16810,7 +16759,7 @@
           <w:noProof/>
         </w:rPr>
         <w:drawing>
-          <wp:anchor distT="0" distB="0" distL="114300" distR="114300" simplePos="0" relativeHeight="251741184" behindDoc="0" locked="0" layoutInCell="1" allowOverlap="1" wp14:anchorId="00FCB62E" wp14:editId="3C23F71C">
+          <wp:anchor distT="0" distB="0" distL="114300" distR="114300" simplePos="0" relativeHeight="251741184" behindDoc="0" locked="0" layoutInCell="1" allowOverlap="1" wp14:anchorId="00FCB62E" wp14:editId="09541DEA">
             <wp:simplePos x="0" y="0"/>
             <wp:positionH relativeFrom="column">
               <wp:posOffset>-81280</wp:posOffset>
@@ -17291,7 +17240,7 @@
           <w:noProof/>
         </w:rPr>
         <w:drawing>
-          <wp:anchor distT="0" distB="0" distL="114300" distR="114300" simplePos="0" relativeHeight="251796480" behindDoc="0" locked="0" layoutInCell="1" allowOverlap="1" wp14:anchorId="258E005B" wp14:editId="136C4872">
+          <wp:anchor distT="0" distB="0" distL="114300" distR="114300" simplePos="0" relativeHeight="251796480" behindDoc="0" locked="0" layoutInCell="1" allowOverlap="1" wp14:anchorId="258E005B" wp14:editId="14E7527C">
             <wp:simplePos x="0" y="0"/>
             <wp:positionH relativeFrom="column">
               <wp:posOffset>29845</wp:posOffset>
@@ -17353,7 +17302,7 @@
           <w:noProof/>
         </w:rPr>
         <w:drawing>
-          <wp:anchor distT="0" distB="0" distL="114300" distR="114300" simplePos="0" relativeHeight="251795456" behindDoc="0" locked="0" layoutInCell="1" allowOverlap="1" wp14:anchorId="32C30B9A" wp14:editId="189E7E9F">
+          <wp:anchor distT="0" distB="0" distL="114300" distR="114300" simplePos="0" relativeHeight="251795456" behindDoc="0" locked="0" layoutInCell="1" allowOverlap="1" wp14:anchorId="32C30B9A" wp14:editId="7FCDCABB">
             <wp:simplePos x="0" y="0"/>
             <wp:positionH relativeFrom="margin">
               <wp:align>right</wp:align>
@@ -17444,16 +17393,11 @@
       <w:r>
         <w:t xml:space="preserve"> of the Types of </w:t>
       </w:r>
-      <w:proofErr w:type="gramStart"/>
       <w:r>
         <w:t>E</w:t>
       </w:r>
       <w:r>
-        <w:t>lement</w:t>
-      </w:r>
-      <w:proofErr w:type="gramEnd"/>
-      <w:r>
-        <w:t xml:space="preserve"> currently available are given in Section </w:t>
+        <w:t xml:space="preserve">lement currently available are given in Section </w:t>
       </w:r>
       <w:r>
         <w:fldChar w:fldCharType="begin"/>
@@ -18013,7 +17957,7 @@
           <w:noProof/>
         </w:rPr>
         <w:drawing>
-          <wp:anchor distT="0" distB="0" distL="114300" distR="114300" simplePos="0" relativeHeight="251801600" behindDoc="0" locked="0" layoutInCell="1" allowOverlap="1" wp14:anchorId="7A2AF236" wp14:editId="6DE8D774">
+          <wp:anchor distT="0" distB="0" distL="114300" distR="114300" simplePos="0" relativeHeight="251801600" behindDoc="0" locked="0" layoutInCell="1" allowOverlap="1" wp14:anchorId="7A2AF236" wp14:editId="3B63D421">
             <wp:simplePos x="0" y="0"/>
             <wp:positionH relativeFrom="column">
               <wp:posOffset>-33293</wp:posOffset>
@@ -18084,7 +18028,7 @@
         </w:rPr>
         <w:lastRenderedPageBreak/>
         <w:drawing>
-          <wp:anchor distT="0" distB="0" distL="114300" distR="114300" simplePos="0" relativeHeight="251817984" behindDoc="0" locked="0" layoutInCell="1" allowOverlap="1" wp14:anchorId="2495D4E1" wp14:editId="26FDB3D6">
+          <wp:anchor distT="0" distB="0" distL="114300" distR="114300" simplePos="0" relativeHeight="251817984" behindDoc="0" locked="0" layoutInCell="1" allowOverlap="1" wp14:anchorId="2495D4E1" wp14:editId="24110119">
             <wp:simplePos x="0" y="0"/>
             <wp:positionH relativeFrom="margin">
               <wp:align>right</wp:align>
@@ -18276,7 +18220,6 @@
         </w:rPr>
         <w:t xml:space="preserve"> (also displays on the </w:t>
       </w:r>
-      <w:proofErr w:type="gramStart"/>
       <w:r>
         <w:rPr>
           <w:b/>
@@ -18284,17 +18227,7 @@
           <w:i/>
           <w:color w:val="565321" w:themeColor="accent2" w:themeShade="80"/>
         </w:rPr>
-        <w:t>Settings</w:t>
-      </w:r>
-      <w:proofErr w:type="gramEnd"/>
-      <w:r>
-        <w:rPr>
-          <w:b/>
-          <w:bCs/>
-          <w:i/>
-          <w:color w:val="565321" w:themeColor="accent2" w:themeShade="80"/>
-        </w:rPr>
-        <w:t>&gt;Saltmarsh</w:t>
+        <w:t>Settings&gt;Saltmarsh</w:t>
       </w:r>
       <w:r>
         <w:rPr>
@@ -18321,7 +18254,7 @@
           <w:noProof/>
         </w:rPr>
         <w:drawing>
-          <wp:anchor distT="0" distB="0" distL="114300" distR="114300" simplePos="0" relativeHeight="251819008" behindDoc="0" locked="0" layoutInCell="1" allowOverlap="1" wp14:anchorId="0525CC7A" wp14:editId="5F5DA7DD">
+          <wp:anchor distT="0" distB="0" distL="114300" distR="114300" simplePos="0" relativeHeight="251819008" behindDoc="0" locked="0" layoutInCell="1" allowOverlap="1" wp14:anchorId="0525CC7A" wp14:editId="23D7ACE8">
             <wp:simplePos x="0" y="0"/>
             <wp:positionH relativeFrom="margin">
               <wp:align>right</wp:align>
@@ -18658,7 +18591,13 @@
         <w:t>Setup&gt;Rivers&gt;River inputs</w:t>
       </w:r>
       <w:r>
-        <w:t xml:space="preserve">: This component can only be added once some channel elements have been setup in the model. If no rivers are defined, the dialog box requires the Channel id number, along with the flow rate and the concentration density of the rivers sediment load. If one or more rivers have already been added, a list box prompts the user to select from a list of channels with river inputs or to Add a river. </w:t>
+        <w:t xml:space="preserve">: This component can only be added once some channel elements have been setup in the model. If no rivers are defined, the dialog box requires the Channel id number, along with the flow rate and the concentration </w:t>
+      </w:r>
+      <w:r>
+        <w:t xml:space="preserve">dry </w:t>
+      </w:r>
+      <w:r>
+        <w:t xml:space="preserve">density of the rivers sediment load. If one or more rivers have already been added, a list box prompts the user to select from a list of channels with river inputs or to Add a river. </w:t>
       </w:r>
     </w:p>
     <w:p>
@@ -18719,7 +18658,7 @@
           <w:noProof/>
         </w:rPr>
         <w:drawing>
-          <wp:anchor distT="0" distB="0" distL="114300" distR="114300" simplePos="0" relativeHeight="251810816" behindDoc="0" locked="0" layoutInCell="1" allowOverlap="1" wp14:anchorId="1F6CC7E3" wp14:editId="42DACFAB">
+          <wp:anchor distT="0" distB="0" distL="114300" distR="114300" simplePos="0" relativeHeight="251810816" behindDoc="0" locked="0" layoutInCell="1" allowOverlap="1" wp14:anchorId="1F6CC7E3" wp14:editId="7C3BF94B">
             <wp:simplePos x="0" y="0"/>
             <wp:positionH relativeFrom="margin">
               <wp:align>right</wp:align>
@@ -18781,15 +18720,7 @@
         <w:t>3</w:t>
       </w:r>
       <w:r>
-        <w:t xml:space="preserve">/s). For river flows, these are defined from the </w:t>
-      </w:r>
-      <w:proofErr w:type="gramStart"/>
-      <w:r>
-        <w:t>River</w:t>
-      </w:r>
-      <w:proofErr w:type="gramEnd"/>
-      <w:r>
-        <w:t xml:space="preserve"> source to the Outside (the open coast). Values are entered in the cell which is from a row element going to a column element (e.g., from Delta to Outside). There should be a mass balance in and out of any element and along the flow path(s) from Source(s) to the Outside. </w:t>
+        <w:t xml:space="preserve">/s). For river flows, these are defined from the River source to the Outside (the open coast). Values are entered in the cell which is from a row element going to a column element (e.g., from Delta to Outside). There should be a mass balance in and out of any element and along the flow path(s) from Source(s) to the Outside. </w:t>
       </w:r>
     </w:p>
     <w:p>
@@ -18977,21 +18908,7 @@
         <w:rPr>
           <w:iCs/>
         </w:rPr>
-        <w:t>to check the flag to ‘</w:t>
-      </w:r>
-      <w:proofErr w:type="gramStart"/>
-      <w:r>
-        <w:rPr>
-          <w:iCs/>
-        </w:rPr>
-        <w:t>Include river</w:t>
-      </w:r>
-      <w:proofErr w:type="gramEnd"/>
-      <w:r>
-        <w:rPr>
-          <w:iCs/>
-        </w:rPr>
-        <w:t xml:space="preserve"> timeseries’.</w:t>
+        <w:t>to check the flag to ‘Include river timeseries’.</w:t>
       </w:r>
       <w:bookmarkEnd w:id="91"/>
     </w:p>
@@ -19072,19 +18989,8 @@
           <w:i/>
           <w:color w:val="565321" w:themeColor="accent2" w:themeShade="80"/>
         </w:rPr>
-        <w:t>Flows&gt;</w:t>
-      </w:r>
-      <w:proofErr w:type="gramStart"/>
-      <w:r>
-        <w:rPr>
-          <w:b/>
-          <w:bCs/>
-          <w:i/>
-          <w:color w:val="565321" w:themeColor="accent2" w:themeShade="80"/>
-        </w:rPr>
-        <w:t>Rivers</w:t>
-      </w:r>
-      <w:proofErr w:type="gramEnd"/>
+        <w:t>Flows&gt;Rivers</w:t>
+      </w:r>
       <w:r>
         <w:t xml:space="preserve"> tab, the inputs defined are tabulated on the </w:t>
       </w:r>
@@ -19734,7 +19640,6 @@
       <w:r>
         <w:t xml:space="preserve">The interventions defined for any element can be viewed using the </w:t>
       </w:r>
-      <w:proofErr w:type="gramStart"/>
       <w:r>
         <w:rPr>
           <w:b/>
@@ -19742,17 +19647,7 @@
           <w:i/>
           <w:color w:val="565321" w:themeColor="accent2" w:themeShade="80"/>
         </w:rPr>
-        <w:t>Settings</w:t>
-      </w:r>
-      <w:proofErr w:type="gramEnd"/>
-      <w:r>
-        <w:rPr>
-          <w:b/>
-          <w:bCs/>
-          <w:i/>
-          <w:color w:val="565321" w:themeColor="accent2" w:themeShade="80"/>
-        </w:rPr>
-        <w:t>&gt;I</w:t>
+        <w:t>Settings&gt;I</w:t>
       </w:r>
       <w:r>
         <w:rPr>
@@ -20222,15 +20117,7 @@
       </w:r>
       <w:r>
         <w:lastRenderedPageBreak/>
-        <w:t xml:space="preserve">selects to continue with the specified time step, the code pads the first time step with additional time steps. In some </w:t>
-      </w:r>
-      <w:proofErr w:type="gramStart"/>
-      <w:r>
-        <w:t>cases</w:t>
-      </w:r>
-      <w:proofErr w:type="gramEnd"/>
-      <w:r>
-        <w:t xml:space="preserve"> this allows the model to rapidly adapt to the forcing conditions and run successfully. </w:t>
+        <w:t xml:space="preserve">selects to continue with the specified time step, the code pads the first time step with additional time steps. In some cases this allows the model to rapidly adapt to the forcing conditions and run successfully. </w:t>
       </w:r>
     </w:p>
     <w:p>
@@ -20451,15 +20338,7 @@
               <w:cnfStyle w:val="000000000000" w:firstRow="0" w:lastRow="0" w:firstColumn="0" w:lastColumn="0" w:oddVBand="0" w:evenVBand="0" w:oddHBand="0" w:evenHBand="0" w:firstRowFirstColumn="0" w:firstRowLastColumn="0" w:lastRowFirstColumn="0" w:lastRowLastColumn="0"/>
             </w:pPr>
             <w:r>
-              <w:t xml:space="preserve">Interventions defined in the Setup&gt;Interventions option </w:t>
-            </w:r>
-            <w:proofErr w:type="gramStart"/>
-            <w:r>
-              <w:t>are</w:t>
-            </w:r>
-            <w:proofErr w:type="gramEnd"/>
-            <w:r>
-              <w:t xml:space="preserve"> included in model runs when this option is selected</w:t>
+              <w:t>Interventions defined in the Setup&gt;Interventions option are included in model runs when this option is selected</w:t>
             </w:r>
           </w:p>
         </w:tc>
@@ -20790,15 +20669,7 @@
               <w:t>Hydraulics&gt;Create Look-up</w:t>
             </w:r>
             <w:r>
-              <w:t xml:space="preserve">) to define the along channel variation in water levels as a function of discharge. When a timeseries of river discharge is </w:t>
-            </w:r>
-            <w:proofErr w:type="gramStart"/>
-            <w:r>
-              <w:t>included</w:t>
-            </w:r>
-            <w:proofErr w:type="gramEnd"/>
-            <w:r>
-              <w:t xml:space="preserve"> this can mean that there is an additional change in the moving surface volumes due to changes in the water level</w:t>
+              <w:t>) to define the along channel variation in water levels as a function of discharge. When a timeseries of river discharge is included this can mean that there is an additional change in the moving surface volumes due to changes in the water level</w:t>
             </w:r>
             <w:r>
               <w:t xml:space="preserve"> stage.</w:t>
@@ -21088,7 +20959,7 @@
           <w:noProof/>
         </w:rPr>
         <w:drawing>
-          <wp:anchor distT="0" distB="0" distL="114300" distR="114300" simplePos="0" relativeHeight="251785216" behindDoc="0" locked="0" layoutInCell="1" allowOverlap="1" wp14:anchorId="2C6C941E" wp14:editId="525FDE2A">
+          <wp:anchor distT="0" distB="0" distL="114300" distR="114300" simplePos="0" relativeHeight="251785216" behindDoc="0" locked="0" layoutInCell="1" allowOverlap="1" wp14:anchorId="2C6C941E" wp14:editId="6C971CE2">
             <wp:simplePos x="0" y="0"/>
             <wp:positionH relativeFrom="margin">
               <wp:align>right</wp:align>
@@ -21156,12 +21027,10 @@
         <w:t xml:space="preserve"> the default is for these to be included (button to right of Var-limits is set to ‘+N’). To exclude </w:t>
       </w:r>
       <w:proofErr w:type="spellStart"/>
-      <w:proofErr w:type="gramStart"/>
       <w:r>
         <w:t>NaNs</w:t>
       </w:r>
       <w:proofErr w:type="spellEnd"/>
-      <w:proofErr w:type="gramEnd"/>
       <w:r>
         <w:t xml:space="preserve"> press the button so that it displays ‘-N’. </w:t>
       </w:r>
@@ -21505,23 +21374,7 @@
       </w:r>
       <w:bookmarkEnd w:id="112"/>
       <w:r>
-        <w:t xml:space="preserve">the Plot UI to select variables and produce several types of </w:t>
-      </w:r>
-      <w:proofErr w:type="gramStart"/>
-      <w:r>
-        <w:t>plot</w:t>
-      </w:r>
-      <w:proofErr w:type="gramEnd"/>
-      <w:r>
-        <w:t xml:space="preserve">. The user selects the Case, Dataset, and Variable to be used and the plot Type from a series of drop-down lists. There are then buttons to create a </w:t>
-      </w:r>
-      <w:proofErr w:type="gramStart"/>
-      <w:r>
-        <w:t>New</w:t>
-      </w:r>
-      <w:proofErr w:type="gramEnd"/>
-      <w:r>
-        <w:t xml:space="preserve"> figure, or Add, or Delete variables from an existing figure for 2D plots, or simply a Select button for 3D plots. The following figures illustrate the options available.</w:t>
+        <w:t>the Plot UI to select variables and produce several types of plot. The user selects the Case, Dataset, and Variable to be used and the plot Type from a series of drop-down lists. There are then buttons to create a New figure, or Add, or Delete variables from an existing figure for 2D plots, or simply a Select button for 3D plots. The following figures illustrate the options available.</w:t>
       </w:r>
     </w:p>
     <w:tbl>
@@ -23427,7 +23280,7 @@
           <w:noProof/>
         </w:rPr>
         <w:drawing>
-          <wp:anchor distT="0" distB="0" distL="114300" distR="114300" simplePos="0" relativeHeight="251772928" behindDoc="0" locked="0" layoutInCell="1" allowOverlap="1" wp14:anchorId="561AD9AD" wp14:editId="2CFBC922">
+          <wp:anchor distT="0" distB="0" distL="114300" distR="114300" simplePos="0" relativeHeight="251772928" behindDoc="0" locked="0" layoutInCell="1" allowOverlap="1" wp14:anchorId="561AD9AD" wp14:editId="016A7856">
             <wp:simplePos x="0" y="0"/>
             <wp:positionH relativeFrom="column">
               <wp:posOffset>31750</wp:posOffset>
@@ -23846,23 +23699,7 @@
         </w:drawing>
       </w:r>
       <w:r>
-        <w:t xml:space="preserve">Once New or Add are selected, the user is asked whether they want to plot the skill score (Yes/No). If </w:t>
-      </w:r>
-      <w:proofErr w:type="gramStart"/>
-      <w:r>
-        <w:t>Yes</w:t>
-      </w:r>
-      <w:proofErr w:type="gramEnd"/>
-      <w:r>
-        <w:t xml:space="preserve">, then the user is prompted to set the skill score parameters.  As further points are added to the plot, this selection remains unchanged (i.e. the skill score is or is not included). To reset the </w:t>
-      </w:r>
-      <w:proofErr w:type="gramStart"/>
-      <w:r>
-        <w:t>option</w:t>
-      </w:r>
-      <w:proofErr w:type="gramEnd"/>
-      <w:r>
-        <w:t xml:space="preserve"> it is necessary to close and reopen the Statistics UI. </w:t>
+        <w:t xml:space="preserve">Once New or Add are selected, the user is asked whether they want to plot the skill score (Yes/No). If Yes, then the user is prompted to set the skill score parameters.  As further points are added to the plot, this selection remains unchanged (i.e. the skill score is or is not included). To reset the option it is necessary to close and reopen the Statistics UI. </w:t>
       </w:r>
     </w:p>
     <w:p>
@@ -23878,7 +23715,7 @@
           <w:noProof/>
         </w:rPr>
         <w:drawing>
-          <wp:anchor distT="0" distB="0" distL="114300" distR="114300" simplePos="0" relativeHeight="251779072" behindDoc="0" locked="0" layoutInCell="1" allowOverlap="1" wp14:anchorId="3F78D689" wp14:editId="284CFFBD">
+          <wp:anchor distT="0" distB="0" distL="114300" distR="114300" simplePos="0" relativeHeight="251779072" behindDoc="0" locked="0" layoutInCell="1" allowOverlap="1" wp14:anchorId="3F78D689" wp14:editId="38070C2A">
             <wp:simplePos x="0" y="0"/>
             <wp:positionH relativeFrom="margin">
               <wp:align>left</wp:align>
@@ -25092,15 +24929,7 @@
         <w:t xml:space="preserve"> </w:t>
       </w:r>
       <w:r>
-        <w:t xml:space="preserve">When in use for </w:t>
-      </w:r>
-      <w:proofErr w:type="gramStart"/>
-      <w:r>
-        <w:t>pan</w:t>
-      </w:r>
-      <w:proofErr w:type="gramEnd"/>
-      <w:r>
-        <w:t xml:space="preserve"> or zoom, the second button is set to ‘On’. Clicking on t</w:t>
+        <w:t>When in use for pan or zoom, the second button is set to ‘On’. Clicking on t</w:t>
       </w:r>
       <w:r>
         <w:t>he ‘</w:t>
@@ -25335,7 +25164,7 @@
           <w:noProof/>
         </w:rPr>
         <w:drawing>
-          <wp:anchor distT="0" distB="0" distL="114300" distR="114300" simplePos="0" relativeHeight="251773952" behindDoc="0" locked="0" layoutInCell="1" allowOverlap="1" wp14:anchorId="22FC696B" wp14:editId="3C306986">
+          <wp:anchor distT="0" distB="0" distL="114300" distR="114300" simplePos="0" relativeHeight="251773952" behindDoc="0" locked="0" layoutInCell="1" allowOverlap="1" wp14:anchorId="22FC696B" wp14:editId="438748F7">
             <wp:simplePos x="0" y="0"/>
             <wp:positionH relativeFrom="column">
               <wp:posOffset>-52387</wp:posOffset>
@@ -25429,7 +25258,7 @@
           <w:noProof/>
         </w:rPr>
         <w:drawing>
-          <wp:anchor distT="0" distB="0" distL="114300" distR="114300" simplePos="0" relativeHeight="251774976" behindDoc="0" locked="0" layoutInCell="1" allowOverlap="1" wp14:anchorId="63116EE3" wp14:editId="257CB4CA">
+          <wp:anchor distT="0" distB="0" distL="114300" distR="114300" simplePos="0" relativeHeight="251774976" behindDoc="0" locked="0" layoutInCell="1" allowOverlap="1" wp14:anchorId="63116EE3" wp14:editId="09816188">
             <wp:simplePos x="0" y="0"/>
             <wp:positionH relativeFrom="column">
               <wp:posOffset>-71755</wp:posOffset>
@@ -25516,7 +25345,7 @@
           <w:noProof/>
         </w:rPr>
         <w:drawing>
-          <wp:anchor distT="0" distB="0" distL="114300" distR="114300" simplePos="0" relativeHeight="251776000" behindDoc="0" locked="0" layoutInCell="1" allowOverlap="1" wp14:anchorId="2C87BD03" wp14:editId="214D171F">
+          <wp:anchor distT="0" distB="0" distL="114300" distR="114300" simplePos="0" relativeHeight="251776000" behindDoc="0" locked="0" layoutInCell="1" allowOverlap="1" wp14:anchorId="2C87BD03" wp14:editId="40B5621A">
             <wp:simplePos x="0" y="0"/>
             <wp:positionH relativeFrom="margin">
               <wp:posOffset>-635</wp:posOffset>
@@ -26737,7 +26566,7 @@
           <v:shape id="_x0000_i1026" type="#_x0000_t75" style="width:108.3pt;height:19.35pt" o:ole="">
             <v:imagedata r:id="rId75" o:title=""/>
           </v:shape>
-          <o:OLEObject Type="Embed" ProgID="Equation.DSMT4" ShapeID="_x0000_i1026" DrawAspect="Content" ObjectID="_1831700703" r:id="rId76"/>
+          <o:OLEObject Type="Embed" ProgID="Equation.DSMT4" ShapeID="_x0000_i1026" DrawAspect="Content" ObjectID="_1833358119" r:id="rId76"/>
         </w:object>
       </w:r>
     </w:p>
@@ -26756,7 +26585,7 @@
           <v:shape id="_x0000_i1027" type="#_x0000_t75" style="width:139.65pt;height:19.35pt" o:ole="">
             <v:imagedata r:id="rId77" o:title=""/>
           </v:shape>
-          <o:OLEObject Type="Embed" ProgID="Equation.DSMT4" ShapeID="_x0000_i1027" DrawAspect="Content" ObjectID="_1831700704" r:id="rId78"/>
+          <o:OLEObject Type="Embed" ProgID="Equation.DSMT4" ShapeID="_x0000_i1027" DrawAspect="Content" ObjectID="_1833358120" r:id="rId78"/>
         </w:object>
       </w:r>
     </w:p>
@@ -26776,7 +26605,7 @@
           <v:shape id="_x0000_i1028" type="#_x0000_t75" style="width:108.3pt;height:36.35pt" o:ole="">
             <v:imagedata r:id="rId79" o:title=""/>
           </v:shape>
-          <o:OLEObject Type="Embed" ProgID="Equation.DSMT4" ShapeID="_x0000_i1028" DrawAspect="Content" ObjectID="_1831700705" r:id="rId80"/>
+          <o:OLEObject Type="Embed" ProgID="Equation.DSMT4" ShapeID="_x0000_i1028" DrawAspect="Content" ObjectID="_1833358121" r:id="rId80"/>
         </w:object>
       </w:r>
       <w:r>
@@ -26790,7 +26619,7 @@
           <v:shape id="_x0000_i1029" type="#_x0000_t75" style="width:114.95pt;height:18pt" o:ole="">
             <v:imagedata r:id="rId81" o:title=""/>
           </v:shape>
-          <o:OLEObject Type="Embed" ProgID="Equation.DSMT4" ShapeID="_x0000_i1029" DrawAspect="Content" ObjectID="_1831700706" r:id="rId82"/>
+          <o:OLEObject Type="Embed" ProgID="Equation.DSMT4" ShapeID="_x0000_i1029" DrawAspect="Content" ObjectID="_1833358122" r:id="rId82"/>
         </w:object>
       </w:r>
       <w:r>
@@ -26804,7 +26633,7 @@
           <v:shape id="_x0000_i1030" type="#_x0000_t75" style="width:64.3pt;height:22.35pt" o:ole="">
             <v:imagedata r:id="rId83" o:title=""/>
           </v:shape>
-          <o:OLEObject Type="Embed" ProgID="Equation.DSMT4" ShapeID="_x0000_i1030" DrawAspect="Content" ObjectID="_1831700707" r:id="rId84"/>
+          <o:OLEObject Type="Embed" ProgID="Equation.DSMT4" ShapeID="_x0000_i1030" DrawAspect="Content" ObjectID="_1833358123" r:id="rId84"/>
         </w:object>
       </w:r>
     </w:p>
@@ -26844,7 +26673,7 @@
           <v:shape id="_x0000_i1031" type="#_x0000_t75" style="width:22.65pt;height:19.35pt" o:ole="">
             <v:imagedata r:id="rId85" o:title=""/>
           </v:shape>
-          <o:OLEObject Type="Embed" ProgID="Equation.DSMT4" ShapeID="_x0000_i1031" DrawAspect="Content" ObjectID="_1831700708" r:id="rId86"/>
+          <o:OLEObject Type="Embed" ProgID="Equation.DSMT4" ShapeID="_x0000_i1031" DrawAspect="Content" ObjectID="_1833358124" r:id="rId86"/>
         </w:object>
       </w:r>
       <w:r>
@@ -26858,7 +26687,7 @@
           <v:shape id="_x0000_i1032" type="#_x0000_t75" style="width:22.65pt;height:18pt" o:ole="">
             <v:imagedata r:id="rId87" o:title=""/>
           </v:shape>
-          <o:OLEObject Type="Embed" ProgID="Equation.DSMT4" ShapeID="_x0000_i1032" DrawAspect="Content" ObjectID="_1831700709" r:id="rId88"/>
+          <o:OLEObject Type="Embed" ProgID="Equation.DSMT4" ShapeID="_x0000_i1032" DrawAspect="Content" ObjectID="_1833358125" r:id="rId88"/>
         </w:object>
       </w:r>
       <w:r>
@@ -26873,7 +26702,7 @@
           <v:shape id="_x0000_i1033" type="#_x0000_t75" style="width:138pt;height:22.35pt" o:ole="">
             <v:imagedata r:id="rId89" o:title=""/>
           </v:shape>
-          <o:OLEObject Type="Embed" ProgID="Equation.DSMT4" ShapeID="_x0000_i1033" DrawAspect="Content" ObjectID="_1831700710" r:id="rId90"/>
+          <o:OLEObject Type="Embed" ProgID="Equation.DSMT4" ShapeID="_x0000_i1033" DrawAspect="Content" ObjectID="_1833358126" r:id="rId90"/>
         </w:object>
       </w:r>
       <w:bookmarkEnd w:id="135"/>
@@ -26893,7 +26722,7 @@
           <v:shape id="_x0000_i1034" type="#_x0000_t75" style="width:61.4pt;height:19.35pt" o:ole="">
             <v:imagedata r:id="rId91" o:title=""/>
           </v:shape>
-          <o:OLEObject Type="Embed" ProgID="Equation.DSMT4" ShapeID="_x0000_i1034" DrawAspect="Content" ObjectID="_1831700711" r:id="rId92"/>
+          <o:OLEObject Type="Embed" ProgID="Equation.DSMT4" ShapeID="_x0000_i1034" DrawAspect="Content" ObjectID="_1833358127" r:id="rId92"/>
         </w:object>
       </w:r>
       <w:r>
@@ -26907,7 +26736,7 @@
           <v:shape id="_x0000_i1035" type="#_x0000_t75" style="width:119pt;height:19.35pt" o:ole="">
             <v:imagedata r:id="rId93" o:title=""/>
           </v:shape>
-          <o:OLEObject Type="Embed" ProgID="Equation.DSMT4" ShapeID="_x0000_i1035" DrawAspect="Content" ObjectID="_1831700712" r:id="rId94"/>
+          <o:OLEObject Type="Embed" ProgID="Equation.DSMT4" ShapeID="_x0000_i1035" DrawAspect="Content" ObjectID="_1833358128" r:id="rId94"/>
         </w:object>
       </w:r>
       <w:r>
@@ -29429,15 +29258,7 @@
     </w:p>
     <w:p>
       <w:r>
-        <w:t xml:space="preserve">The vertical exchange (although not strictly a sediment </w:t>
-      </w:r>
-      <w:proofErr w:type="gramStart"/>
-      <w:r>
-        <w:t>fall</w:t>
-      </w:r>
-      <w:proofErr w:type="gramEnd"/>
-      <w:r>
-        <w:t xml:space="preserve"> velocity) should be based on the fall velocity for the sediment type that characterises most of the element.  There is an inter-dependence between the fall velocity and the horizontal exchange which is explained further in the Section on Dispersion.</w:t>
+        <w:t>The vertical exchange (although not strictly a sediment fall velocity) should be based on the fall velocity for the sediment type that characterises most of the element.  There is an inter-dependence between the fall velocity and the horizontal exchange which is explained further in the Section on Dispersion.</w:t>
       </w:r>
     </w:p>
     <w:p/>
@@ -29959,7 +29780,7 @@
           <v:shape id="_x0000_i1036" type="#_x0000_t75" style="width:53.35pt;height:34.35pt" o:ole="">
             <v:imagedata r:id="rId95" o:title=""/>
           </v:shape>
-          <o:OLEObject Type="Embed" ProgID="Equation.3" ShapeID="_x0000_i1036" DrawAspect="Content" ObjectID="_1831700713" r:id="rId96"/>
+          <o:OLEObject Type="Embed" ProgID="Equation.3" ShapeID="_x0000_i1036" DrawAspect="Content" ObjectID="_1833358129" r:id="rId96"/>
         </w:object>
       </w:r>
       <w:r>
@@ -30348,7 +30169,60 @@
         <w:t>P</w:t>
       </w:r>
       <w:r>
-        <w:t xml:space="preserve"> is the tidal period in seconds and simply assumes a sinusoidal variation in velocity over the tidal cycle.  Model output can be used to define the excursion, if available.</w:t>
+        <w:t xml:space="preserve"> is the tidal period in seconds and simply assumes a sinusoidal variation in velocity over the tidal cycle.  </w:t>
+      </w:r>
+      <w:r>
+        <w:t>Taken together, the dispersion between channel elements can be written as:</w:t>
+      </w:r>
+    </w:p>
+    <w:p>
+      <w:pPr>
+        <w:jc w:val="right"/>
+      </w:pPr>
+      <w:r>
+        <w:t xml:space="preserve"> </w:t>
+      </w:r>
+      <w:r>
+        <w:rPr>
+          <w:position w:val="-16"/>
+        </w:rPr>
+        <w:object w:dxaOrig="2659" w:dyaOrig="440" w14:anchorId="08FD755E">
+          <v:shape id="_x0000_i1037" type="#_x0000_t75" style="width:132.95pt;height:22pt" o:ole="">
+            <v:imagedata r:id="rId97" o:title=""/>
+          </v:shape>
+          <o:OLEObject Type="Embed" ProgID="Equation.DSMT4" ShapeID="_x0000_i1037" DrawAspect="Content" ObjectID="_1833358130" r:id="rId98"/>
+        </w:object>
+      </w:r>
+      <w:r>
+        <w:tab/>
+      </w:r>
+      <w:r>
+        <w:tab/>
+      </w:r>
+      <w:r>
+        <w:tab/>
+      </w:r>
+      <w:r>
+        <w:tab/>
+      </w:r>
+      <w:r>
+        <w:tab/>
+        <w:t>(4)</w:t>
+      </w:r>
+    </w:p>
+    <w:p/>
+    <w:p>
+      <w:r>
+        <w:t>Measurements or process m</w:t>
+      </w:r>
+      <w:r>
+        <w:t>odel output can</w:t>
+      </w:r>
+      <w:r>
+        <w:t xml:space="preserve"> also</w:t>
+      </w:r>
+      <w:r>
+        <w:t xml:space="preserve"> be used to define the excursion, if available.</w:t>
       </w:r>
     </w:p>
     <w:p>
@@ -30388,7 +30262,6 @@
         <w:jc w:val="both"/>
       </w:pPr>
       <w:r>
-        <w:lastRenderedPageBreak/>
         <w:t>Use the channel estimate of</w:t>
       </w:r>
       <w:r>
@@ -30499,7 +30372,13 @@
       </w:r>
       <w:r>
         <w:tab/>
-        <w:t>(4)</w:t>
+        <w:t>(</w:t>
+      </w:r>
+      <w:r>
+        <w:t>5</w:t>
+      </w:r>
+      <w:r>
+        <w:t>)</w:t>
       </w:r>
     </w:p>
     <w:p>
@@ -30649,7 +30528,13 @@
       </w:r>
       <w:proofErr w:type="spellEnd"/>
       <w:r>
-        <w:t xml:space="preserve"> as given in equation (4).</w:t>
+        <w:t xml:space="preserve"> as given in equation (</w:t>
+      </w:r>
+      <w:r>
+        <w:t>5</w:t>
+      </w:r>
+      <w:r>
+        <w:t>).</w:t>
       </w:r>
     </w:p>
     <w:p>
@@ -30735,13 +30620,118 @@
         <w:rPr>
           <w:i/>
         </w:rPr>
-        <w:t>/(</w:t>
+        <w:t>/</w:t>
+      </w:r>
+      <w:r>
+        <w:rPr>
+          <w:i/>
+          <w:vertAlign w:val="superscript"/>
+        </w:rPr>
+        <w:t>.</w:t>
+      </w:r>
+      <w:r>
+        <w:rPr>
+          <w:i/>
+        </w:rPr>
+        <w:t>T</w:t>
+      </w:r>
+      <w:r>
+        <w:rPr>
+          <w:i/>
+          <w:vertAlign w:val="subscript"/>
+        </w:rPr>
+        <w:t>P</w:t>
+      </w:r>
+      <w:r>
+        <w:tab/>
+      </w:r>
+      <w:r>
+        <w:tab/>
+      </w:r>
+      <w:r>
+        <w:tab/>
+      </w:r>
+      <w:r>
+        <w:tab/>
+      </w:r>
+      <w:r>
+        <w:tab/>
+      </w:r>
+      <w:r>
+        <w:tab/>
+        <w:t>(</w:t>
+      </w:r>
+      <w:r>
+        <w:t>6</w:t>
+      </w:r>
+      <w:r>
+        <w:t>)</w:t>
+      </w:r>
+    </w:p>
+    <w:p>
+      <w:r>
+        <w:t xml:space="preserve">where </w:t>
       </w:r>
       <w:proofErr w:type="spellStart"/>
       <w:r>
         <w:rPr>
           <w:i/>
         </w:rPr>
+        <w:t>W</w:t>
+      </w:r>
+      <w:r>
+        <w:rPr>
+          <w:i/>
+          <w:vertAlign w:val="subscript"/>
+        </w:rPr>
+        <w:t>fl</w:t>
+      </w:r>
+      <w:proofErr w:type="spellEnd"/>
+      <w:r>
+        <w:t xml:space="preserve"> is the average width of the tidal flats and can be estimated from </w:t>
+      </w:r>
+      <w:proofErr w:type="spellStart"/>
+      <w:r>
+        <w:rPr>
+          <w:i/>
+        </w:rPr>
+        <w:t>S</w:t>
+      </w:r>
+      <w:r>
+        <w:rPr>
+          <w:i/>
+          <w:vertAlign w:val="subscript"/>
+        </w:rPr>
+        <w:t>fl</w:t>
+      </w:r>
+      <w:proofErr w:type="spellEnd"/>
+      <w:r>
+        <w:rPr>
+          <w:i/>
+          <w:vertAlign w:val="subscript"/>
+        </w:rPr>
+        <w:t xml:space="preserve"> </w:t>
+      </w:r>
+      <w:r>
+        <w:rPr>
+          <w:i/>
+        </w:rPr>
+        <w:t>/</w:t>
+      </w:r>
+      <w:r>
+        <w:rPr>
+          <w:i/>
+        </w:rPr>
+        <w:t>(</w:t>
+      </w:r>
+      <w:r>
+        <w:t xml:space="preserve"> </w:t>
+      </w:r>
+      <w:proofErr w:type="spellStart"/>
+      <w:r>
+        <w:rPr>
+          <w:i/>
+        </w:rPr>
         <w:t>n</w:t>
       </w:r>
       <w:r>
@@ -30754,106 +30744,31 @@
       <w:proofErr w:type="spellEnd"/>
       <w:r>
         <w:rPr>
-          <w:i/>
           <w:vertAlign w:val="subscript"/>
         </w:rPr>
         <w:t xml:space="preserve"> </w:t>
       </w:r>
       <w:r>
-        <w:rPr>
-          <w:i/>
-          <w:vertAlign w:val="superscript"/>
-        </w:rPr>
         <w:t>.</w:t>
       </w:r>
       <w:r>
         <w:rPr>
           <w:i/>
         </w:rPr>
-        <w:t>T</w:t>
+        <w:t>L</w:t>
       </w:r>
       <w:r>
         <w:rPr>
           <w:i/>
           <w:vertAlign w:val="subscript"/>
         </w:rPr>
-        <w:t>P</w:t>
-      </w:r>
-      <w:r>
-        <w:rPr>
-          <w:i/>
-        </w:rPr>
-        <w:t>)</w:t>
-      </w:r>
-      <w:r>
-        <w:tab/>
-      </w:r>
-      <w:r>
-        <w:tab/>
-      </w:r>
-      <w:r>
-        <w:tab/>
-      </w:r>
-      <w:r>
-        <w:tab/>
-      </w:r>
-      <w:r>
-        <w:tab/>
-        <w:t>(5)</w:t>
-      </w:r>
-    </w:p>
-    <w:p>
-      <w:r>
-        <w:t xml:space="preserve">where </w:t>
-      </w:r>
-      <w:proofErr w:type="spellStart"/>
-      <w:r>
-        <w:rPr>
-          <w:i/>
-        </w:rPr>
-        <w:t>W</w:t>
-      </w:r>
-      <w:r>
-        <w:rPr>
-          <w:i/>
-          <w:vertAlign w:val="subscript"/>
-        </w:rPr>
-        <w:t>fl</w:t>
-      </w:r>
-      <w:proofErr w:type="spellEnd"/>
-      <w:r>
-        <w:t xml:space="preserve"> is the average width of the tidal flats and can be estimated from </w:t>
-      </w:r>
-      <w:proofErr w:type="spellStart"/>
-      <w:r>
-        <w:rPr>
-          <w:i/>
-        </w:rPr>
-        <w:t>S</w:t>
-      </w:r>
-      <w:r>
-        <w:rPr>
-          <w:i/>
-          <w:vertAlign w:val="subscript"/>
-        </w:rPr>
-        <w:t>fl</w:t>
-      </w:r>
-      <w:proofErr w:type="spellEnd"/>
-      <w:r>
-        <w:rPr>
-          <w:i/>
-        </w:rPr>
-        <w:t>/L</w:t>
-      </w:r>
-      <w:r>
-        <w:rPr>
-          <w:i/>
-          <w:vertAlign w:val="subscript"/>
-        </w:rPr>
         <w:t>R</w:t>
       </w:r>
       <w:r>
-        <w:t xml:space="preserve"> and </w:t>
+        <w:t xml:space="preserve">) </w:t>
+      </w:r>
+      <w:r>
+        <w:t xml:space="preserve">and </w:t>
       </w:r>
       <w:proofErr w:type="spellStart"/>
       <w:r>
@@ -31046,7 +30961,73 @@
       </w:r>
       <w:r>
         <w:tab/>
-        <w:t>(6)</w:t>
+        <w:t>(</w:t>
+      </w:r>
+      <w:r>
+        <w:t>7</w:t>
+      </w:r>
+      <w:r>
+        <w:t>)</w:t>
+      </w:r>
+    </w:p>
+    <w:p>
+      <w:r>
+        <w:t>Which can be written</w:t>
+      </w:r>
+      <w:r>
+        <w:t xml:space="preserve">, using </w:t>
+      </w:r>
+      <w:proofErr w:type="spellStart"/>
+      <w:r>
+        <w:rPr>
+          <w:i/>
+          <w:iCs/>
+        </w:rPr>
+        <w:t>V</w:t>
+      </w:r>
+      <w:r>
+        <w:rPr>
+          <w:i/>
+          <w:iCs/>
+          <w:vertAlign w:val="subscript"/>
+        </w:rPr>
+        <w:t>fl</w:t>
+      </w:r>
+      <w:proofErr w:type="spellEnd"/>
+      <w:r>
+        <w:t xml:space="preserve"> as the volume of the tidal flat element,</w:t>
+      </w:r>
+      <w:r>
+        <w:t xml:space="preserve"> as:</w:t>
+      </w:r>
+    </w:p>
+    <w:p>
+      <w:pPr>
+        <w:jc w:val="right"/>
+      </w:pPr>
+      <w:r>
+        <w:rPr>
+          <w:position w:val="-16"/>
+        </w:rPr>
+        <w:object w:dxaOrig="2700" w:dyaOrig="480" w14:anchorId="6AE023F3">
+          <v:shape id="_x0000_i1038" type="#_x0000_t75" style="width:135pt;height:24pt" o:ole="">
+            <v:imagedata r:id="rId99" o:title=""/>
+          </v:shape>
+          <o:OLEObject Type="Embed" ProgID="Equation.DSMT4" ShapeID="_x0000_i1038" DrawAspect="Content" ObjectID="_1833358131" r:id="rId100"/>
+        </w:object>
+      </w:r>
+      <w:r>
+        <w:tab/>
+      </w:r>
+      <w:r>
+        <w:tab/>
+      </w:r>
+      <w:r>
+        <w:tab/>
+      </w:r>
+      <w:r>
+        <w:tab/>
+        <w:t>(8)</w:t>
       </w:r>
     </w:p>
     <w:p>
@@ -31150,6 +31131,7 @@
     </w:p>
     <w:p>
       <w:r>
+        <w:lastRenderedPageBreak/>
         <w:t xml:space="preserve">For a single (channel) element model a concentration associated with advective flow through the element, that is less than </w:t>
       </w:r>
       <w:proofErr w:type="spellStart"/>
@@ -31179,11 +31161,7 @@
     </w:p>
     <w:p>
       <w:r>
-        <w:t xml:space="preserve">For a multi-element definition of the channel, this is no longer the case, providing the dispersion between channel elements varies, and there are two or more channel elements, the element connected to the river inflow will adjust according to the exchange with the downstream element and this is </w:t>
-      </w:r>
-      <w:r>
-        <w:lastRenderedPageBreak/>
-        <w:t>distinct from the exchange of the last element that is connected to the open sea environment.  The system can therefore co-adjust to take account of the different concentrations at the respective boundaries.</w:t>
+        <w:t>For a multi-element definition of the channel, this is no longer the case, providing the dispersion between channel elements varies, and there are two or more channel elements, the element connected to the river inflow will adjust according to the exchange with the downstream element and this is distinct from the exchange of the last element that is connected to the open sea environment.  The system can therefore co-adjust to take account of the different concentrations at the respective boundaries.</w:t>
       </w:r>
     </w:p>
     <w:p/>
@@ -31760,6 +31738,7 @@
         <w:rPr>
           <w:noProof/>
         </w:rPr>
+        <w:lastRenderedPageBreak/>
         <mc:AlternateContent>
           <mc:Choice Requires="wps">
             <w:drawing>
@@ -32024,7 +32003,6 @@
         <w:rPr>
           <w:noProof/>
         </w:rPr>
-        <w:lastRenderedPageBreak/>
         <mc:AlternateContent>
           <mc:Choice Requires="wps">
             <w:drawing>
@@ -32611,6 +32589,7 @@
     </w:p>
     <w:p>
       <w:r>
+        <w:lastRenderedPageBreak/>
         <w:t>Generic – linear law</w:t>
       </w:r>
     </w:p>
@@ -33170,7 +33149,6 @@
       <w:bookmarkStart w:id="183" w:name="_Hlk158127815"/>
       <w:bookmarkEnd w:id="182"/>
       <w:r>
-        <w:lastRenderedPageBreak/>
         <w:t>The values provided can be used for an initial setup and then edited to meet the specific model requirements or as part of the model calibration using</w:t>
       </w:r>
       <w:r>
@@ -33515,15 +33493,7 @@
         <w:t>)</w:t>
       </w:r>
       <w:r>
-        <w:t xml:space="preserve">, where x </w:t>
-      </w:r>
-      <w:proofErr w:type="gramStart"/>
-      <w:r>
-        <w:t>is</w:t>
-      </w:r>
-      <w:proofErr w:type="gramEnd"/>
-      <w:r>
-        <w:t xml:space="preserve"> the [tidal prism];</w:t>
+        <w:t>, where x is the [tidal prism];</w:t>
       </w:r>
     </w:p>
     <w:p>
@@ -33563,15 +33533,7 @@
         <w:t>β</w:t>
       </w:r>
       <w:r>
-        <w:t xml:space="preserve">), where x </w:t>
-      </w:r>
-      <w:proofErr w:type="gramStart"/>
-      <w:r>
-        <w:t>is</w:t>
-      </w:r>
-      <w:proofErr w:type="gramEnd"/>
-      <w:r>
-        <w:t xml:space="preserve"> the </w:t>
+        <w:t xml:space="preserve">), where x is the </w:t>
       </w:r>
       <w:r>
         <w:t xml:space="preserve">[plan area x </w:t>
@@ -33772,15 +33734,7 @@
         <w:t>β</w:t>
       </w:r>
       <w:r>
-        <w:t xml:space="preserve">), where x </w:t>
-      </w:r>
-      <w:proofErr w:type="gramStart"/>
-      <w:r>
-        <w:t>is</w:t>
-      </w:r>
-      <w:proofErr w:type="gramEnd"/>
-      <w:r>
-        <w:t xml:space="preserve"> the </w:t>
+        <w:t xml:space="preserve">), where x is the </w:t>
       </w:r>
       <w:r>
         <w:t>[</w:t>
@@ -33952,6 +33906,7 @@
     </w:p>
     <w:p>
       <w:r>
+        <w:lastRenderedPageBreak/>
         <w:t>E</w:t>
       </w:r>
       <w:r>
@@ -34019,7 +33974,6 @@
       <w:bookmarkStart w:id="188" w:name="_Toc192914932"/>
       <w:bookmarkStart w:id="189" w:name="_Hlk53505707"/>
       <w:r>
-        <w:lastRenderedPageBreak/>
         <w:t>File format for loading interventions</w:t>
       </w:r>
       <w:bookmarkEnd w:id="187"/>
@@ -34664,7 +34618,11 @@
         <w:t xml:space="preserve"> change). Thereafter the elements will adjust based on the defined equilibrium conditions for the element. </w:t>
       </w:r>
       <w:r>
-        <w:t>In this version of the model, there is no basis for an equilibrium area. It therefore makes no sense to retain the initial area as the “equilibrium” condition. Consequently, the area is adjusted, to give a new surface area, that then remains constant until any further intervention. Such changes may alter the tidal prism (e.g., for a tidal flat with equilibrium defined in terms of area and tidal range)</w:t>
+        <w:t xml:space="preserve">In this </w:t>
+      </w:r>
+      <w:r>
+        <w:lastRenderedPageBreak/>
+        <w:t>version of the model, there is no basis for an equilibrium area. It therefore makes no sense to retain the initial area as the “equilibrium” condition. Consequently, the area is adjusted, to give a new surface area, that then remains constant until any further intervention. Such changes may alter the tidal prism (e.g., for a tidal flat with equilibrium defined in terms of area and tidal range)</w:t>
       </w:r>
       <w:r>
         <w:t xml:space="preserve">, which will </w:t>
@@ -34784,7 +34742,6 @@
         <w:t xml:space="preserve">the adjustment to the equilibrium area only needs to be made once. </w:t>
       </w:r>
       <w:r>
-        <w:lastRenderedPageBreak/>
         <w:t xml:space="preserve">Equilibrium volumes, however, are reset each time step based on the chosen relationship (usually based on prism or surface area). </w:t>
       </w:r>
       <w:r>
@@ -35916,6 +35873,7 @@
         </w:numPr>
       </w:pPr>
       <w:r>
+        <w:lastRenderedPageBreak/>
         <w:t>Element types that contribute to the prism include tidal flat, saltmarsh, storage, and delta flat. Non-prism elements are channel, flood delta and ebb delta. Element types outside the estuary/inlet (</w:t>
       </w:r>
       <w:r>
@@ -36255,7 +36213,6 @@
           <w:b/>
           <w:bCs/>
         </w:rPr>
-        <w:lastRenderedPageBreak/>
         <w:t>Active/Inactive Elements</w:t>
       </w:r>
     </w:p>
@@ -36609,7 +36566,11 @@
         <w:t>,</w:t>
       </w:r>
       <w:r>
-        <w:t xml:space="preserve"> using the prism relationship defined by the Equilibrium Coefficients. These values may need to be adjusted </w:t>
+        <w:t xml:space="preserve"> using the prism relationship defined by the Equilibrium </w:t>
+      </w:r>
+      <w:r>
+        <w:lastRenderedPageBreak/>
+        <w:t xml:space="preserve">Coefficients. These values may need to be adjusted </w:t>
       </w:r>
       <w:r>
         <w:t xml:space="preserve">for the saltmarsh </w:t>
@@ -36693,7 +36654,6 @@
         </w:numPr>
       </w:pPr>
       <w:r>
-        <w:lastRenderedPageBreak/>
         <w:t xml:space="preserve">Define an intervention for the marsh element </w:t>
       </w:r>
       <w:r>
@@ -36724,15 +36684,7 @@
         <w:t xml:space="preserve"> the volume can also be removed </w:t>
       </w:r>
       <w:r>
-        <w:t xml:space="preserve">but has not </w:t>
-      </w:r>
-      <w:proofErr w:type="gramStart"/>
-      <w:r>
-        <w:t>effect</w:t>
-      </w:r>
-      <w:proofErr w:type="gramEnd"/>
-      <w:r>
-        <w:t xml:space="preserve"> on the results</w:t>
+        <w:t>but has not effect on the results</w:t>
       </w:r>
       <w:r>
         <w:t xml:space="preserve"> </w:t>
@@ -38096,7 +38048,11 @@
         <w:t>et al</w:t>
       </w:r>
       <w:r>
-        <w:t xml:space="preserve">. (2004), it is possible to derive estimates of </w:t>
+        <w:t xml:space="preserve">. </w:t>
+      </w:r>
+      <w:r>
+        <w:lastRenderedPageBreak/>
+        <w:t xml:space="preserve">(2004), it is possible to derive estimates of </w:t>
       </w:r>
       <w:r>
         <w:rPr>
@@ -38241,7 +38197,6 @@
     </w:p>
     <w:p>
       <w:r>
-        <w:lastRenderedPageBreak/>
         <w:t xml:space="preserve">The utility in </w:t>
       </w:r>
       <w:r>
@@ -38495,7 +38450,11 @@
         <w:t>s</w:t>
       </w:r>
       <w:r>
-        <w:t xml:space="preserve"> in the estuary depending on the relative strength of the two influences. The landward mechanism has been characterised as tidal pumping </w:t>
+        <w:t xml:space="preserve"> in the estuary depending on the relative strength of the two influences. The landward mechanism has been characterised as tidal </w:t>
+      </w:r>
+      <w:r>
+        <w:lastRenderedPageBreak/>
+        <w:t xml:space="preserve">pumping </w:t>
       </w:r>
       <w:r>
         <w:fldChar w:fldCharType="begin">
@@ -38786,13 +38745,8 @@
         <w:t>(</w:t>
       </w:r>
       <w:proofErr w:type="spellStart"/>
-      <w:proofErr w:type="gramStart"/>
-      <w:r>
-        <w:t>max</w:t>
-      </w:r>
-      <w:proofErr w:type="gramEnd"/>
-      <w:r>
-        <w:t>_slr</w:t>
+      <w:r>
+        <w:t>max_slr</w:t>
       </w:r>
       <w:proofErr w:type="spellEnd"/>
       <w:r>
@@ -39048,12 +39002,10 @@
         <w:t xml:space="preserve">, the default is for these to be included (button to right of Variable is set to ‘+N’). To exclude </w:t>
       </w:r>
       <w:proofErr w:type="spellStart"/>
-      <w:proofErr w:type="gramStart"/>
       <w:r>
         <w:t>NaNs</w:t>
       </w:r>
       <w:proofErr w:type="spellEnd"/>
-      <w:proofErr w:type="gramEnd"/>
       <w:r>
         <w:t xml:space="preserve"> press the button so that it displays ‘-N’. The selection is based on the variable limits defined whenever a variable is assigned to X, Y or Z using the X, Y, Z buttons.</w:t>
       </w:r>
@@ -39402,6 +39354,7 @@
       <w:bookmarkStart w:id="211" w:name="_Hlk41120321"/>
       <w:bookmarkStart w:id="212" w:name="_Hlk77169607"/>
       <w:r>
+        <w:lastRenderedPageBreak/>
         <w:t xml:space="preserve">If the function returns a single valued answer, this is displayed in a message box, otherwise it is saved, either by adding to an existing dataset, or creating a new one (see Section </w:t>
       </w:r>
       <w:r>
@@ -39484,7 +39437,6 @@
         <w:rPr>
           <w:i/>
         </w:rPr>
-        <w:lastRenderedPageBreak/>
         <w:t>NB1: functions are forced to lower case (to be consistent with all Matlab functions), so any external user defined function call must be named in lower case.</w:t>
       </w:r>
     </w:p>
@@ -39861,6 +39813,7 @@
     </w:p>
     <w:p>
       <w:r>
+        <w:lastRenderedPageBreak/>
         <w:t xml:space="preserve">New functions can be added by simply editing the struct in </w:t>
       </w:r>
       <w:proofErr w:type="spellStart"/>
@@ -39869,15 +39822,7 @@
       </w:r>
       <w:proofErr w:type="spellEnd"/>
       <w:r>
-        <w:t xml:space="preserve">, noting that the cell array of each field in the struct must contain an entry for the function being added. In </w:t>
-      </w:r>
-      <w:proofErr w:type="gramStart"/>
-      <w:r>
-        <w:t>addition</w:t>
-      </w:r>
-      <w:proofErr w:type="gramEnd"/>
-      <w:r>
-        <w:t xml:space="preserve"> a sub-selection of the list can be associated with a given App based on the class name of the main UI. To amend the selection included with an App or to add a selection for a new App edit the ‘</w:t>
+        <w:t>, noting that the cell array of each field in the struct must contain an entry for the function being added. In addition a sub-selection of the list can be associated with a given App based on the class name of the main UI. To amend the selection included with an App or to add a selection for a new App edit the ‘</w:t>
       </w:r>
       <w:r>
         <w:rPr>
@@ -40487,6 +40432,7 @@
           <w:sz w:val="20"/>
           <w:szCs w:val="20"/>
         </w:rPr>
+        <w:lastRenderedPageBreak/>
         <w:t>subsample_ts</w:t>
       </w:r>
       <w:proofErr w:type="spellEnd"/>
@@ -40694,7 +40640,6 @@
           <w:i/>
           <w:iCs/>
         </w:rPr>
-        <w:lastRenderedPageBreak/>
         <w:t>Recursive plot</w:t>
       </w:r>
       <w:r>
@@ -41552,7 +41497,7 @@
                     </pic:cNvPicPr>
                   </pic:nvPicPr>
                   <pic:blipFill>
-                    <a:blip r:embed="rId97" cstate="print">
+                    <a:blip r:embed="rId101" cstate="print">
                       <a:extLst>
                         <a:ext uri="{28A0092B-C50C-407E-A947-70E740481C1C}">
                           <a14:useLocalDpi xmlns:a14="http://schemas.microsoft.com/office/drawing/2010/main" val="0"/>
@@ -41831,10 +41776,10 @@
           <w:position w:val="-52"/>
         </w:rPr>
         <w:object w:dxaOrig="3920" w:dyaOrig="1160" w14:anchorId="49793AFE">
-          <v:shape id="_x0000_i1037" type="#_x0000_t75" style="width:196pt;height:58pt" o:ole="">
-            <v:imagedata r:id="rId98" o:title=""/>
+          <v:shape id="_x0000_i1039" type="#_x0000_t75" style="width:196pt;height:58pt" o:ole="">
+            <v:imagedata r:id="rId102" o:title=""/>
           </v:shape>
-          <o:OLEObject Type="Embed" ProgID="Equation.DSMT4" ShapeID="_x0000_i1037" DrawAspect="Content" ObjectID="_1831700714" r:id="rId99"/>
+          <o:OLEObject Type="Embed" ProgID="Equation.DSMT4" ShapeID="_x0000_i1039" DrawAspect="Content" ObjectID="_1833358132" r:id="rId103"/>
         </w:object>
       </w:r>
     </w:p>
@@ -42694,7 +42639,7 @@
                     </pic:cNvPicPr>
                   </pic:nvPicPr>
                   <pic:blipFill>
-                    <a:blip r:embed="rId100">
+                    <a:blip r:embed="rId104">
                       <a:extLst>
                         <a:ext uri="{28A0092B-C50C-407E-A947-70E740481C1C}">
                           <a14:useLocalDpi xmlns:a14="http://schemas.microsoft.com/office/drawing/2010/main" val="0"/>
@@ -42834,7 +42779,7 @@
           <w:noProof/>
         </w:rPr>
         <w:drawing>
-          <wp:inline distT="0" distB="0" distL="0" distR="0" wp14:anchorId="7D80D3E7" wp14:editId="35EEB2C6">
+          <wp:inline distT="0" distB="0" distL="0" distR="0" wp14:anchorId="7D80D3E7" wp14:editId="18B05B90">
             <wp:extent cx="5722982" cy="2964407"/>
             <wp:effectExtent l="0" t="0" r="0" b="7620"/>
             <wp:docPr id="48" name="Picture 48" descr="Timeline&#10;&#10;Description automatically generated"/>
@@ -42851,7 +42796,7 @@
                     </pic:cNvPicPr>
                   </pic:nvPicPr>
                   <pic:blipFill>
-                    <a:blip r:embed="rId101" cstate="print">
+                    <a:blip r:embed="rId105" cstate="print">
                       <a:extLst>
                         <a:ext uri="{28A0092B-C50C-407E-A947-70E740481C1C}">
                           <a14:useLocalDpi xmlns:a14="http://schemas.microsoft.com/office/drawing/2010/main" val="0"/>
@@ -44659,7 +44604,7 @@
       <w:r>
         <w:t>Garnier, R., Townend, I., Monge-Ganuzas, M., de Santiago, I., Liria, P., Abalia, A., Epelde, I., Campo, A.d., Chust, G., Valle, M., González, M., Mader, J., Gómez, M., Castillo, C., Uriarte, A., 2022. Modelling the morphological response of the Oka estuary (SE Bay of Biscay) to climate change. Estuarine, Coastal and Shelf Science, 279, 108133. [</w:t>
       </w:r>
-      <w:hyperlink r:id="rId102" w:history="1">
+      <w:hyperlink r:id="rId106" w:history="1">
         <w:r>
           <w:rPr>
             <w:rStyle w:val="Hyperlink"/>
@@ -44700,7 +44645,7 @@
       <w:r>
         <w:t>Kragtwijk, N.G., Stive, M.J.F., Wang, Z.B., Zitman, T.J., 2004. Morphological response of tidal basins to human interventions. Coastal Engineering, 51, 207-221. [</w:t>
       </w:r>
-      <w:hyperlink r:id="rId103" w:history="1">
+      <w:hyperlink r:id="rId107" w:history="1">
         <w:r>
           <w:rPr>
             <w:rStyle w:val="Hyperlink"/>
@@ -44802,7 +44747,7 @@
         <w:lastRenderedPageBreak/>
         <w:t>Townend, I.H., Wang, Z.B., Rees, J.G., 2007. Millennial to annual volume changes in the Humber Estuary. Proc.R.Soc.A, 463, 837-854. [</w:t>
       </w:r>
-      <w:hyperlink r:id="rId104" w:history="1">
+      <w:hyperlink r:id="rId108" w:history="1">
         <w:r>
           <w:rPr>
             <w:rStyle w:val="Hyperlink"/>
@@ -44823,7 +44768,7 @@
       <w:r>
         <w:t>Townend, I.H., Wang, Z.B., Stive, M.J.E., Zhou, Z., 2016a. Development and extension of an aggregated scale model: Part 1 – Background to ASMITA. China Ocean Engineering, 30(4), 482-504. [</w:t>
       </w:r>
-      <w:hyperlink r:id="rId105" w:history="1">
+      <w:hyperlink r:id="rId109" w:history="1">
         <w:r>
           <w:rPr>
             <w:rStyle w:val="Hyperlink"/>
@@ -44844,7 +44789,7 @@
       <w:r>
         <w:t>Townend, I.H., Wang, Z.B., Stive, M.J.E., Zhou, Z., 2016b. Development and extension of an aggregated scale model: Part 2 – Extensions to ASMITA. China Ocean Engineering, 30(5), 651-670. [</w:t>
       </w:r>
-      <w:hyperlink r:id="rId106" w:history="1">
+      <w:hyperlink r:id="rId110" w:history="1">
         <w:r>
           <w:rPr>
             <w:rStyle w:val="Hyperlink"/>
@@ -44865,7 +44810,7 @@
       <w:r>
         <w:t>van Goor, M.A., Zitman, T.J., Wang, Z.B., Stive, M.J.F., 2003. Impact of sea-level rise on the morphological equilibrium state of tidal inlets. Marine Geology, 202, 211-227. [</w:t>
       </w:r>
-      <w:hyperlink r:id="rId107" w:history="1">
+      <w:hyperlink r:id="rId111" w:history="1">
         <w:r>
           <w:rPr>
             <w:rStyle w:val="Hyperlink"/>
@@ -44906,7 +44851,7 @@
       <w:r>
         <w:t>Wang, Z.B., de Vriend, H.J., Stive, M.J.F., Townend, I.H., 2008. On the parameter setting of semi-empirical long-term morphological models for estuaries and tidal lagoons. In: C.M. Dohmen-Janssen, S.J.M.H. Hulscher (Eds.), River, Coastal and Estuarine Morphodynamics. Taylor &amp; Francis, Utrecht, pp. 103-111. [</w:t>
       </w:r>
-      <w:hyperlink r:id="rId108" w:history="1">
+      <w:hyperlink r:id="rId112" w:history="1">
         <w:r>
           <w:rPr>
             <w:rStyle w:val="Hyperlink"/>
@@ -45062,7 +45007,7 @@
                     </pic:cNvPicPr>
                   </pic:nvPicPr>
                   <pic:blipFill>
-                    <a:blip r:embed="rId109" cstate="print">
+                    <a:blip r:embed="rId113" cstate="print">
                       <a:extLst>
                         <a:ext uri="{28A0092B-C50C-407E-A947-70E740481C1C}">
                           <a14:useLocalDpi xmlns:a14="http://schemas.microsoft.com/office/drawing/2010/main" val="0"/>
@@ -45160,10 +45105,10 @@
           <w:position w:val="-32"/>
         </w:rPr>
         <w:object w:dxaOrig="1960" w:dyaOrig="800" w14:anchorId="73BA004B">
-          <v:shape id="_x0000_i1038" type="#_x0000_t75" style="width:97.3pt;height:40.65pt" o:ole="">
-            <v:imagedata r:id="rId110" o:title=""/>
+          <v:shape id="_x0000_i1040" type="#_x0000_t75" style="width:97.3pt;height:40.65pt" o:ole="">
+            <v:imagedata r:id="rId114" o:title=""/>
           </v:shape>
-          <o:OLEObject Type="Embed" ProgID="Equation.3" ShapeID="_x0000_i1038" DrawAspect="Content" ObjectID="_1831700715" r:id="rId111"/>
+          <o:OLEObject Type="Embed" ProgID="Equation.3" ShapeID="_x0000_i1040" DrawAspect="Content" ObjectID="_1833358133" r:id="rId115"/>
         </w:object>
       </w:r>
       <w:r>
@@ -45203,10 +45148,10 @@
           <w:position w:val="-36"/>
         </w:rPr>
         <w:object w:dxaOrig="4080" w:dyaOrig="840" w14:anchorId="41AA22C6">
-          <v:shape id="_x0000_i1039" type="#_x0000_t75" style="width:205.65pt;height:40.65pt" o:ole="">
-            <v:imagedata r:id="rId112" o:title=""/>
+          <v:shape id="_x0000_i1041" type="#_x0000_t75" style="width:205.65pt;height:40.65pt" o:ole="">
+            <v:imagedata r:id="rId116" o:title=""/>
           </v:shape>
-          <o:OLEObject Type="Embed" ProgID="Equation.DSMT4" ShapeID="_x0000_i1039" DrawAspect="Content" ObjectID="_1831700716" r:id="rId113"/>
+          <o:OLEObject Type="Embed" ProgID="Equation.DSMT4" ShapeID="_x0000_i1041" DrawAspect="Content" ObjectID="_1833358134" r:id="rId117"/>
         </w:object>
       </w:r>
       <w:r>
@@ -45301,10 +45246,10 @@
           <w:position w:val="-80"/>
         </w:rPr>
         <w:object w:dxaOrig="4380" w:dyaOrig="1700" w14:anchorId="0EF2940D">
-          <v:shape id="_x0000_i1052" type="#_x0000_t75" style="width:217.45pt;height:85pt" o:ole="">
-            <v:imagedata r:id="rId114" o:title=""/>
+          <v:shape id="_x0000_i1042" type="#_x0000_t75" style="width:217.45pt;height:85pt" o:ole="">
+            <v:imagedata r:id="rId118" o:title=""/>
           </v:shape>
-          <o:OLEObject Type="Embed" ProgID="Equation.DSMT4" ShapeID="_x0000_i1052" DrawAspect="Content" ObjectID="_1831700717" r:id="rId115"/>
+          <o:OLEObject Type="Embed" ProgID="Equation.DSMT4" ShapeID="_x0000_i1042" DrawAspect="Content" ObjectID="_1833358135" r:id="rId119"/>
         </w:object>
       </w:r>
       <w:bookmarkEnd w:id="270"/>
@@ -45335,7 +45280,6 @@
         </w:rPr>
         <w:t>δ</w:t>
       </w:r>
-      <w:proofErr w:type="gramStart"/>
       <w:r>
         <w:rPr>
           <w:i/>
@@ -45344,7 +45288,6 @@
         <w:t>i,j</w:t>
       </w:r>
       <w:proofErr w:type="spellEnd"/>
-      <w:proofErr w:type="gramEnd"/>
       <w:r>
         <w:t xml:space="preserve"> = </w:t>
       </w:r>
@@ -45397,14 +45340,13 @@
           <w:position w:val="-80"/>
         </w:rPr>
         <w:object w:dxaOrig="4360" w:dyaOrig="1700" w14:anchorId="0B265E5D">
-          <v:shape id="_x0000_i1047" type="#_x0000_t75" style="width:216.7pt;height:85pt" o:ole="">
-            <v:imagedata r:id="rId116" o:title=""/>
+          <v:shape id="_x0000_i1043" type="#_x0000_t75" style="width:216.7pt;height:85pt" o:ole="">
+            <v:imagedata r:id="rId120" o:title=""/>
           </v:shape>
-          <o:OLEObject Type="Embed" ProgID="Equation.DSMT4" ShapeID="_x0000_i1047" DrawAspect="Content" ObjectID="_1831700718" r:id="rId117"/>
+          <o:OLEObject Type="Embed" ProgID="Equation.DSMT4" ShapeID="_x0000_i1043" DrawAspect="Content" ObjectID="_1833358136" r:id="rId121"/>
         </w:object>
       </w:r>
       <w:bookmarkEnd w:id="271"/>
-      <w:proofErr w:type="gramStart"/>
       <w:r>
         <w:rPr>
           <w:rFonts w:hint="eastAsia"/>
@@ -45417,15 +45359,7 @@
           <w:rFonts w:hint="eastAsia"/>
           <w:lang w:eastAsia="zh-CN"/>
         </w:rPr>
-        <w:t xml:space="preserve">   </w:t>
-      </w:r>
-      <w:proofErr w:type="gramEnd"/>
-      <w:r>
-        <w:rPr>
-          <w:rFonts w:hint="eastAsia"/>
-          <w:lang w:eastAsia="zh-CN"/>
-        </w:rPr>
-        <w:t xml:space="preserve">                           </w:t>
+        <w:t xml:space="preserve">                              </w:t>
       </w:r>
       <w:r>
         <w:t>(P1.2)</w:t>
@@ -45593,7 +45527,7 @@
                     </pic:cNvPicPr>
                   </pic:nvPicPr>
                   <pic:blipFill>
-                    <a:blip r:embed="rId118">
+                    <a:blip r:embed="rId122">
                       <a:extLst>
                         <a:ext uri="{28A0092B-C50C-407E-A947-70E740481C1C}">
                           <a14:useLocalDpi xmlns:a14="http://schemas.microsoft.com/office/drawing/2010/main" val="0"/>
@@ -45664,7 +45598,7 @@
                     <pic:cNvPicPr/>
                   </pic:nvPicPr>
                   <pic:blipFill>
-                    <a:blip r:embed="rId119">
+                    <a:blip r:embed="rId123">
                       <a:extLst>
                         <a:ext uri="{28A0092B-C50C-407E-A947-70E740481C1C}">
                           <a14:useLocalDpi xmlns:a14="http://schemas.microsoft.com/office/drawing/2010/main" val="0"/>
@@ -45783,7 +45717,7 @@
                     <pic:cNvPicPr/>
                   </pic:nvPicPr>
                   <pic:blipFill>
-                    <a:blip r:embed="rId120">
+                    <a:blip r:embed="rId124">
                       <a:extLst>
                         <a:ext uri="{28A0092B-C50C-407E-A947-70E740481C1C}">
                           <a14:useLocalDpi xmlns:a14="http://schemas.microsoft.com/office/drawing/2010/main" val="0"/>

</xml_diff>

<commit_message>
Update install file version number
</commit_message>
<xml_diff>
--- a/app/doc/ASMITA manual_v35.docx
+++ b/app/doc/ASMITA manual_v35.docx
@@ -653,7 +653,7 @@
                 <w:b w:val="0"/>
                 <w:bCs w:val="0"/>
               </w:rPr>
-              <w:t>3.5</w:t>
+              <w:t>3.53</w:t>
             </w:r>
           </w:p>
         </w:tc>
@@ -668,7 +668,7 @@
               <w:cnfStyle w:val="000000100000" w:firstRow="0" w:lastRow="0" w:firstColumn="0" w:lastColumn="0" w:oddVBand="0" w:evenVBand="0" w:oddHBand="1" w:evenHBand="0" w:firstRowFirstColumn="0" w:firstRowLastColumn="0" w:lastRowFirstColumn="0" w:lastRowLastColumn="0"/>
             </w:pPr>
             <w:r>
-              <w:t>Jan 2024</w:t>
+              <w:t>Apr 2026</w:t>
             </w:r>
           </w:p>
         </w:tc>
@@ -682,34 +682,7 @@
               <w:cnfStyle w:val="000000100000" w:firstRow="0" w:lastRow="0" w:firstColumn="0" w:lastColumn="0" w:oddVBand="0" w:evenVBand="0" w:oddHBand="1" w:evenHBand="0" w:firstRowFirstColumn="0" w:firstRowLastColumn="0" w:lastRowFirstColumn="0" w:lastRowLastColumn="0"/>
             </w:pPr>
             <w:r>
-              <w:t>Added additional checks on model stability. Revised conditions for limiting erosion and fixing interventions. Improved stability when area or vertical exchange goes to zero (e</w:t>
-            </w:r>
-            <w:r>
-              <w:t>.</w:t>
-            </w:r>
-            <w:r>
-              <w:t>g</w:t>
-            </w:r>
-            <w:r>
-              <w:t>.,</w:t>
-            </w:r>
-            <w:r>
-              <w:t xml:space="preserve"> to simulate closure and opening of marshes).</w:t>
-            </w:r>
-          </w:p>
-          <w:p>
-            <w:pPr>
-              <w:snapToGrid w:val="0"/>
-              <w:cnfStyle w:val="000000100000" w:firstRow="0" w:lastRow="0" w:firstColumn="0" w:lastColumn="0" w:oddVBand="0" w:evenVBand="0" w:oddHBand="1" w:evenHBand="0" w:firstRowFirstColumn="0" w:firstRowLastColumn="0" w:lastRowFirstColumn="0" w:lastRowLastColumn="0"/>
-            </w:pPr>
-            <w:r>
-              <w:t xml:space="preserve">Updated function for simple_tide now used. Utility to update models to latest version of code added. Tool to plot multiple elements from PlotUI added. </w:t>
-            </w:r>
-            <w:r>
-              <w:t>Added matrix condition checks and option to display a summary plot during run time.</w:t>
-            </w:r>
-            <w:r>
-              <w:t xml:space="preserve"> Added check that toolboxes are installed. Implemented checks when using Response tab.</w:t>
+              <w:t>Additional documentation added and updated</w:t>
             </w:r>
           </w:p>
         </w:tc>
@@ -734,7 +707,7 @@
                 <w:b w:val="0"/>
                 <w:bCs w:val="0"/>
               </w:rPr>
-              <w:t>3.4</w:t>
+              <w:t>3.5</w:t>
             </w:r>
           </w:p>
         </w:tc>
@@ -749,7 +722,7 @@
               <w:cnfStyle w:val="000000000000" w:firstRow="0" w:lastRow="0" w:firstColumn="0" w:lastColumn="0" w:oddVBand="0" w:evenVBand="0" w:oddHBand="0" w:evenHBand="0" w:firstRowFirstColumn="0" w:firstRowLastColumn="0" w:lastRowFirstColumn="0" w:lastRowLastColumn="0"/>
             </w:pPr>
             <w:r>
-              <w:t>Sept 2023</w:t>
+              <w:t>Jan 2024</w:t>
             </w:r>
           </w:p>
         </w:tc>
@@ -763,37 +736,34 @@
               <w:cnfStyle w:val="000000000000" w:firstRow="0" w:lastRow="0" w:firstColumn="0" w:lastColumn="0" w:oddVBand="0" w:evenVBand="0" w:oddHBand="0" w:evenHBand="0" w:firstRowFirstColumn="0" w:firstRowLastColumn="0" w:lastRowFirstColumn="0" w:lastRowLastColumn="0"/>
             </w:pPr>
             <w:r>
-              <w:t xml:space="preserve">Interventions can now be set to be erodible or non-erodible. </w:t>
-            </w:r>
-            <w:r>
-              <w:t xml:space="preserve">Equilibrium for beach type elements can now use drift rate as an alternative to prism or tidal range to define the equilibrium volume. </w:t>
-            </w:r>
-            <w:r>
-              <w:t>Added option to plot differences of variable as a Scaling option.</w:t>
-            </w:r>
-            <w:r>
-              <w:t xml:space="preserve"> Water level offset for tidal range cycles modified to ensure variation gives correct mean tide.</w:t>
-            </w:r>
-            <w:r>
-              <w:t xml:space="preserve"> Saltmarsh algorithm improved to be stable when switching to zero depth and to bare flat depth and find the correct root for the equilibrium depth</w:t>
-            </w:r>
-            <w:r>
-              <w:t xml:space="preserve">. </w:t>
-            </w:r>
-            <w:r>
-              <w:t xml:space="preserve">Bug fixes for </w:t>
-            </w:r>
-            <w:r>
-              <w:t xml:space="preserve">(i) time series drift from a single source, (ii) </w:t>
-            </w:r>
-            <w:r>
-              <w:t xml:space="preserve">advection tabs used before models runs and </w:t>
-            </w:r>
-            <w:r>
-              <w:t xml:space="preserve">(iii) </w:t>
-            </w:r>
-            <w:r>
-              <w:t>handling of data time and duration options (duration used if start time =0). Table formatting with large numerical values improved. Pan and zoom button handling improved.</w:t>
+              <w:t>Added additional checks on model stability. Revised conditions for limiting erosion and fixing interventions. Improved stability when area or vertical exchange goes to zero (e</w:t>
+            </w:r>
+            <w:r>
+              <w:t>.</w:t>
+            </w:r>
+            <w:r>
+              <w:t>g</w:t>
+            </w:r>
+            <w:r>
+              <w:t>.,</w:t>
+            </w:r>
+            <w:r>
+              <w:t xml:space="preserve"> to simulate closure and opening of marshes).</w:t>
+            </w:r>
+          </w:p>
+          <w:p>
+            <w:pPr>
+              <w:snapToGrid w:val="0"/>
+              <w:cnfStyle w:val="000000000000" w:firstRow="0" w:lastRow="0" w:firstColumn="0" w:lastColumn="0" w:oddVBand="0" w:evenVBand="0" w:oddHBand="0" w:evenHBand="0" w:firstRowFirstColumn="0" w:firstRowLastColumn="0" w:lastRowFirstColumn="0" w:lastRowLastColumn="0"/>
+            </w:pPr>
+            <w:r>
+              <w:t xml:space="preserve">Updated function for simple_tide now used. Utility to update models to latest version of code added. Tool to plot multiple elements from PlotUI added. </w:t>
+            </w:r>
+            <w:r>
+              <w:t>Added matrix condition checks and option to display a summary plot during run time.</w:t>
+            </w:r>
+            <w:r>
+              <w:t xml:space="preserve"> Added check that toolboxes are installed. Implemented checks when using Response tab.</w:t>
             </w:r>
           </w:p>
         </w:tc>
@@ -821,7 +791,7 @@
                 <w:b w:val="0"/>
                 <w:bCs w:val="0"/>
               </w:rPr>
-              <w:t>3.3</w:t>
+              <w:t>3.4</w:t>
             </w:r>
           </w:p>
         </w:tc>
@@ -836,7 +806,7 @@
               <w:cnfStyle w:val="000000100000" w:firstRow="0" w:lastRow="0" w:firstColumn="0" w:lastColumn="0" w:oddVBand="0" w:evenVBand="0" w:oddHBand="1" w:evenHBand="0" w:firstRowFirstColumn="0" w:firstRowLastColumn="0" w:lastRowFirstColumn="0" w:lastRowLastColumn="0"/>
             </w:pPr>
             <w:r>
-              <w:t>July 2023</w:t>
+              <w:t>Sept 2023</w:t>
             </w:r>
           </w:p>
         </w:tc>
@@ -850,19 +820,37 @@
               <w:cnfStyle w:val="000000100000" w:firstRow="0" w:lastRow="0" w:firstColumn="0" w:lastColumn="0" w:oddVBand="0" w:evenVBand="0" w:oddHBand="1" w:evenHBand="0" w:firstRowFirstColumn="0" w:firstRowLastColumn="0" w:lastRowFirstColumn="0" w:lastRowLastColumn="0"/>
             </w:pPr>
             <w:r>
-              <w:t>Added functions and scripts to run Asmita from the command line or in batch mode. Added Unit testing for set of models that test the range of functionality available.</w:t>
-            </w:r>
-            <w:r>
-              <w:t xml:space="preserve"> Added option to Time plots to use a pivot year to define the start point (y-value and time) for all lines included on plot.</w:t>
-            </w:r>
-            <w:r>
-              <w:t xml:space="preserve"> Modified handling of saltmarsh equilibrium when water depth is zero and removed scaling to initial values for saltmarsh and storage elements. Added option to use time-varying horizontal </w:t>
-            </w:r>
-            <w:r>
-              <w:t xml:space="preserve">and vertical </w:t>
-            </w:r>
-            <w:r>
-              <w:t>exchanges. Added moving surface area to output variables (to view interventions).</w:t>
+              <w:t xml:space="preserve">Interventions can now be set to be erodible or non-erodible. </w:t>
+            </w:r>
+            <w:r>
+              <w:t xml:space="preserve">Equilibrium for beach type elements can now use drift rate as an alternative to prism or tidal range to define the equilibrium volume. </w:t>
+            </w:r>
+            <w:r>
+              <w:t>Added option to plot differences of variable as a Scaling option.</w:t>
+            </w:r>
+            <w:r>
+              <w:t xml:space="preserve"> Water level offset for tidal range cycles modified to ensure variation gives correct mean tide.</w:t>
+            </w:r>
+            <w:r>
+              <w:t xml:space="preserve"> Saltmarsh algorithm improved to be stable when switching to zero depth and to bare flat depth and find the correct root for the equilibrium depth</w:t>
+            </w:r>
+            <w:r>
+              <w:t xml:space="preserve">. </w:t>
+            </w:r>
+            <w:r>
+              <w:t xml:space="preserve">Bug fixes for </w:t>
+            </w:r>
+            <w:r>
+              <w:t xml:space="preserve">(i) time series drift from a single source, (ii) </w:t>
+            </w:r>
+            <w:r>
+              <w:t xml:space="preserve">advection tabs used before models runs and </w:t>
+            </w:r>
+            <w:r>
+              <w:t xml:space="preserve">(iii) </w:t>
+            </w:r>
+            <w:r>
+              <w:t>handling of data time and duration options (duration used if start time =0). Table formatting with large numerical values improved. Pan and zoom button handling improved.</w:t>
             </w:r>
           </w:p>
         </w:tc>
@@ -887,7 +875,7 @@
                 <w:b w:val="0"/>
                 <w:bCs w:val="0"/>
               </w:rPr>
-              <w:t>3.2</w:t>
+              <w:t>3.3</w:t>
             </w:r>
           </w:p>
         </w:tc>
@@ -902,7 +890,7 @@
               <w:cnfStyle w:val="000000000000" w:firstRow="0" w:lastRow="0" w:firstColumn="0" w:lastColumn="0" w:oddVBand="0" w:evenVBand="0" w:oddHBand="0" w:evenHBand="0" w:firstRowFirstColumn="0" w:firstRowLastColumn="0" w:lastRowFirstColumn="0" w:lastRowLastColumn="0"/>
             </w:pPr>
             <w:r>
-              <w:t>June 2023</w:t>
+              <w:t>July 2023</w:t>
             </w:r>
           </w:p>
         </w:tc>
@@ -916,7 +904,19 @@
               <w:cnfStyle w:val="000000000000" w:firstRow="0" w:lastRow="0" w:firstColumn="0" w:lastColumn="0" w:oddVBand="0" w:evenVBand="0" w:oddHBand="0" w:evenHBand="0" w:firstRowFirstColumn="0" w:firstRowLastColumn="0" w:lastRowFirstColumn="0" w:lastRowLastColumn="0"/>
             </w:pPr>
             <w:r>
-              <w:t>Added Help options for Documentation (online), Manual and Papers that detail theoretical background.</w:t>
+              <w:t>Added functions and scripts to run Asmita from the command line or in batch mode. Added Unit testing for set of models that test the range of functionality available.</w:t>
+            </w:r>
+            <w:r>
+              <w:t xml:space="preserve"> Added option to Time plots to use a pivot year to define the start point (y-value and time) for all lines included on plot.</w:t>
+            </w:r>
+            <w:r>
+              <w:t xml:space="preserve"> Modified handling of saltmarsh equilibrium when water depth is zero and removed scaling to initial values for saltmarsh and storage elements. Added option to use time-varying horizontal </w:t>
+            </w:r>
+            <w:r>
+              <w:t xml:space="preserve">and vertical </w:t>
+            </w:r>
+            <w:r>
+              <w:t>exchanges. Added moving surface area to output variables (to view interventions).</w:t>
             </w:r>
           </w:p>
         </w:tc>
@@ -944,7 +944,7 @@
                 <w:b w:val="0"/>
                 <w:bCs w:val="0"/>
               </w:rPr>
-              <w:t>3.1</w:t>
+              <w:t>3.2</w:t>
             </w:r>
           </w:p>
         </w:tc>
@@ -959,10 +959,7 @@
               <w:cnfStyle w:val="000000100000" w:firstRow="0" w:lastRow="0" w:firstColumn="0" w:lastColumn="0" w:oddVBand="0" w:evenVBand="0" w:oddHBand="1" w:evenHBand="0" w:firstRowFirstColumn="0" w:firstRowLastColumn="0" w:lastRowFirstColumn="0" w:lastRowLastColumn="0"/>
             </w:pPr>
             <w:r>
-              <w:t>Oct</w:t>
-            </w:r>
-            <w:r>
-              <w:t xml:space="preserve"> 2022</w:t>
+              <w:t>June 2023</w:t>
             </w:r>
           </w:p>
         </w:tc>
@@ -976,43 +973,7 @@
               <w:cnfStyle w:val="000000100000" w:firstRow="0" w:lastRow="0" w:firstColumn="0" w:lastColumn="0" w:oddVBand="0" w:evenVBand="0" w:oddHBand="1" w:evenHBand="0" w:firstRowFirstColumn="0" w:firstRowLastColumn="0" w:lastRowFirstColumn="0" w:lastRowLastColumn="0"/>
             </w:pPr>
             <w:r>
-              <w:t>Added option to examine sea level rise over the Holocene (</w:t>
-            </w:r>
-            <w:r>
-              <w:t>i.e.,</w:t>
-            </w:r>
-            <w:r>
-              <w:t xml:space="preserve"> for periods prior to 0 A.D) see Section </w:t>
-            </w:r>
-            <w:r>
-              <w:fldChar w:fldCharType="begin"/>
-            </w:r>
-            <w:r>
-              <w:instrText xml:space="preserve"> REF _Ref458867188 \r \h </w:instrText>
-            </w:r>
-            <w:r>
-              <w:fldChar w:fldCharType="separate"/>
-            </w:r>
-            <w:r>
-              <w:t>6.2</w:t>
-            </w:r>
-            <w:r>
-              <w:fldChar w:fldCharType="end"/>
-            </w:r>
-            <w:r>
-              <w:t>.</w:t>
-            </w:r>
-            <w:r>
-              <w:t xml:space="preserve"> </w:t>
-            </w:r>
-          </w:p>
-          <w:p>
-            <w:pPr>
-              <w:snapToGrid w:val="0"/>
-              <w:cnfStyle w:val="000000100000" w:firstRow="0" w:lastRow="0" w:firstColumn="0" w:lastColumn="0" w:oddVBand="0" w:evenVBand="0" w:oddHBand="1" w:evenHBand="0" w:firstRowFirstColumn="0" w:firstRowLastColumn="0" w:lastRowFirstColumn="0" w:lastRowLastColumn="0"/>
-            </w:pPr>
-            <w:r>
-              <w:t>Various error traps added to improve editing and modifying of model components. Error in reloading past cases corrected.</w:t>
+              <w:t>Added Help options for Documentation (online), Manual and Papers that detail theoretical background.</w:t>
             </w:r>
           </w:p>
         </w:tc>
@@ -1037,7 +998,7 @@
                 <w:b w:val="0"/>
                 <w:bCs w:val="0"/>
               </w:rPr>
-              <w:t>3.0</w:t>
+              <w:t>3.1</w:t>
             </w:r>
           </w:p>
         </w:tc>
@@ -1052,7 +1013,10 @@
               <w:cnfStyle w:val="000000000000" w:firstRow="0" w:lastRow="0" w:firstColumn="0" w:lastColumn="0" w:oddVBand="0" w:evenVBand="0" w:oddHBand="0" w:evenHBand="0" w:firstRowFirstColumn="0" w:firstRowLastColumn="0" w:lastRowFirstColumn="0" w:lastRowLastColumn="0"/>
             </w:pPr>
             <w:r>
-              <w:t>Oct 2021</w:t>
+              <w:t>Oct</w:t>
+            </w:r>
+            <w:r>
+              <w:t xml:space="preserve"> 2022</w:t>
             </w:r>
           </w:p>
         </w:tc>
@@ -1066,13 +1030,43 @@
               <w:cnfStyle w:val="000000000000" w:firstRow="0" w:lastRow="0" w:firstColumn="0" w:lastColumn="0" w:oddVBand="0" w:evenVBand="0" w:oddHBand="0" w:evenHBand="0" w:firstRowFirstColumn="0" w:firstRowLastColumn="0" w:lastRowFirstColumn="0" w:lastRowLastColumn="0"/>
             </w:pPr>
             <w:r>
-              <w:t>ASMITA ported to run as an App using the modelui toolbox.</w:t>
-            </w:r>
-            <w:r>
-              <w:t xml:space="preserve"> Added option to include along channel changes in water level due to river-tide interactions using the CSTmodel. Graphics </w:t>
-            </w:r>
-            <w:r>
-              <w:t>modified to make use of new interface.</w:t>
+              <w:t>Added option to examine sea level rise over the Holocene (</w:t>
+            </w:r>
+            <w:r>
+              <w:t>i.e.,</w:t>
+            </w:r>
+            <w:r>
+              <w:t xml:space="preserve"> for periods prior to 0 A.D) see Section </w:t>
+            </w:r>
+            <w:r>
+              <w:fldChar w:fldCharType="begin"/>
+            </w:r>
+            <w:r>
+              <w:instrText xml:space="preserve"> REF _Ref458867188 \r \h </w:instrText>
+            </w:r>
+            <w:r>
+              <w:fldChar w:fldCharType="separate"/>
+            </w:r>
+            <w:r>
+              <w:t>6.2</w:t>
+            </w:r>
+            <w:r>
+              <w:fldChar w:fldCharType="end"/>
+            </w:r>
+            <w:r>
+              <w:t>.</w:t>
+            </w:r>
+            <w:r>
+              <w:t xml:space="preserve"> </w:t>
+            </w:r>
+          </w:p>
+          <w:p>
+            <w:pPr>
+              <w:snapToGrid w:val="0"/>
+              <w:cnfStyle w:val="000000000000" w:firstRow="0" w:lastRow="0" w:firstColumn="0" w:lastColumn="0" w:oddVBand="0" w:evenVBand="0" w:oddHBand="0" w:evenHBand="0" w:firstRowFirstColumn="0" w:firstRowLastColumn="0" w:lastRowFirstColumn="0" w:lastRowLastColumn="0"/>
+            </w:pPr>
+            <w:r>
+              <w:t>Various error traps added to improve editing and modifying of model components. Error in reloading past cases corrected.</w:t>
             </w:r>
           </w:p>
         </w:tc>
@@ -1092,14 +1086,15 @@
               <w:jc w:val="center"/>
               <w:rPr>
                 <w:b w:val="0"/>
+                <w:bCs w:val="0"/>
               </w:rPr>
             </w:pPr>
             <w:r>
               <w:rPr>
                 <w:b w:val="0"/>
-              </w:rPr>
-              <w:lastRenderedPageBreak/>
-              <w:t>2.0</w:t>
+                <w:bCs w:val="0"/>
+              </w:rPr>
+              <w:t>3.0</w:t>
             </w:r>
           </w:p>
         </w:tc>
@@ -1114,7 +1109,7 @@
               <w:cnfStyle w:val="000000100000" w:firstRow="0" w:lastRow="0" w:firstColumn="0" w:lastColumn="0" w:oddVBand="0" w:evenVBand="0" w:oddHBand="1" w:evenHBand="0" w:firstRowFirstColumn="0" w:firstRowLastColumn="0" w:lastRowFirstColumn="0" w:lastRowLastColumn="0"/>
             </w:pPr>
             <w:r>
-              <w:t>Nov 2020</w:t>
+              <w:t>Oct 2021</w:t>
             </w:r>
           </w:p>
         </w:tc>
@@ -1128,7 +1123,13 @@
               <w:cnfStyle w:val="000000100000" w:firstRow="0" w:lastRow="0" w:firstColumn="0" w:lastColumn="0" w:oddVBand="0" w:evenVBand="0" w:oddHBand="1" w:evenHBand="0" w:firstRowFirstColumn="0" w:firstRowLastColumn="0" w:lastRowFirstColumn="0" w:lastRowLastColumn="0"/>
             </w:pPr>
             <w:r>
-              <w:t>ASMITA OO ported to work as model ASMITA within the ModelUI framework.</w:t>
+              <w:t>ASMITA ported to run as an App using the modelui toolbox.</w:t>
+            </w:r>
+            <w:r>
+              <w:t xml:space="preserve"> Added option to include along channel changes in water level due to river-tide interactions using the CSTmodel. Graphics </w:t>
+            </w:r>
+            <w:r>
+              <w:t>modified to make use of new interface.</w:t>
             </w:r>
           </w:p>
         </w:tc>
@@ -1143,13 +1144,16 @@
             <w:pPr>
               <w:snapToGrid w:val="0"/>
               <w:jc w:val="center"/>
+              <w:rPr>
+                <w:b w:val="0"/>
+              </w:rPr>
             </w:pPr>
             <w:r>
               <w:rPr>
                 <w:b w:val="0"/>
-                <w:bCs w:val="0"/>
-              </w:rPr>
-              <w:t>1.5</w:t>
+              </w:rPr>
+              <w:lastRenderedPageBreak/>
+              <w:t>2.0</w:t>
             </w:r>
           </w:p>
         </w:tc>
@@ -1164,7 +1168,7 @@
               <w:cnfStyle w:val="000000000000" w:firstRow="0" w:lastRow="0" w:firstColumn="0" w:lastColumn="0" w:oddVBand="0" w:evenVBand="0" w:oddHBand="0" w:evenHBand="0" w:firstRowFirstColumn="0" w:firstRowLastColumn="0" w:lastRowFirstColumn="0" w:lastRowLastColumn="0"/>
             </w:pPr>
             <w:r>
-              <w:t>Oct.2020</w:t>
+              <w:t>Nov 2020</w:t>
             </w:r>
           </w:p>
         </w:tc>
@@ -1178,79 +1182,7 @@
               <w:cnfStyle w:val="000000000000" w:firstRow="0" w:lastRow="0" w:firstColumn="0" w:lastColumn="0" w:oddVBand="0" w:evenVBand="0" w:oddHBand="0" w:evenHBand="0" w:firstRowFirstColumn="0" w:firstRowLastColumn="0" w:lastRowFirstColumn="0" w:lastRowLastColumn="0"/>
             </w:pPr>
             <w:r>
-              <w:t xml:space="preserve">Added inlet model. See Section </w:t>
-            </w:r>
-            <w:r>
-              <w:fldChar w:fldCharType="begin"/>
-            </w:r>
-            <w:r>
-              <w:instrText xml:space="preserve"> REF _Ref53422643 \r \h </w:instrText>
-            </w:r>
-            <w:r>
-              <w:fldChar w:fldCharType="separate"/>
-            </w:r>
-            <w:r>
-              <w:t>3.5</w:t>
-            </w:r>
-            <w:r>
-              <w:fldChar w:fldCharType="end"/>
-            </w:r>
-            <w:r>
-              <w:t>.</w:t>
-            </w:r>
-          </w:p>
-          <w:p>
-            <w:pPr>
-              <w:snapToGrid w:val="0"/>
-              <w:cnfStyle w:val="000000000000" w:firstRow="0" w:lastRow="0" w:firstColumn="0" w:lastColumn="0" w:oddVBand="0" w:evenVBand="0" w:oddHBand="0" w:evenHBand="0" w:firstRowFirstColumn="0" w:firstRowLastColumn="0" w:lastRowFirstColumn="0" w:lastRowLastColumn="0"/>
-            </w:pPr>
-            <w:r>
-              <w:t xml:space="preserve">Added option to define element specific equilibrium volume using tidal range rather than tidal prism. See Sections </w:t>
-            </w:r>
-            <w:r>
-              <w:fldChar w:fldCharType="begin"/>
-            </w:r>
-            <w:r>
-              <w:instrText xml:space="preserve"> REF _Ref83058435 \r \h </w:instrText>
-            </w:r>
-            <w:r>
-              <w:fldChar w:fldCharType="separate"/>
-            </w:r>
-            <w:r>
-              <w:t>5.4</w:t>
-            </w:r>
-            <w:r>
-              <w:fldChar w:fldCharType="end"/>
-            </w:r>
-            <w:r>
-              <w:t xml:space="preserve"> and </w:t>
-            </w:r>
-            <w:r>
-              <w:fldChar w:fldCharType="begin"/>
-            </w:r>
-            <w:r>
-              <w:instrText xml:space="preserve"> REF _Ref458860700 \r \h </w:instrText>
-            </w:r>
-            <w:r>
-              <w:fldChar w:fldCharType="separate"/>
-            </w:r>
-            <w:r>
-              <w:t>6.1</w:t>
-            </w:r>
-            <w:r>
-              <w:fldChar w:fldCharType="end"/>
-            </w:r>
-            <w:r>
-              <w:t>.</w:t>
-            </w:r>
-          </w:p>
-          <w:p>
-            <w:pPr>
-              <w:snapToGrid w:val="0"/>
-              <w:cnfStyle w:val="000000000000" w:firstRow="0" w:lastRow="0" w:firstColumn="0" w:lastColumn="0" w:oddVBand="0" w:evenVBand="0" w:oddHBand="0" w:evenHBand="0" w:firstRowFirstColumn="0" w:firstRowLastColumn="0" w:lastRowFirstColumn="0" w:lastRowLastColumn="0"/>
-            </w:pPr>
-            <w:r>
-              <w:t xml:space="preserve">Updated Unit Testing tools. </w:t>
+              <w:t>ASMITA OO ported to work as model ASMITA within the ModelUI framework.</w:t>
             </w:r>
           </w:p>
         </w:tc>
@@ -1268,15 +1200,13 @@
             <w:pPr>
               <w:snapToGrid w:val="0"/>
               <w:jc w:val="center"/>
+            </w:pPr>
+            <w:r>
               <w:rPr>
                 <w:b w:val="0"/>
-              </w:rPr>
-            </w:pPr>
-            <w:r>
-              <w:rPr>
-                <w:b w:val="0"/>
-              </w:rPr>
-              <w:t>1.4</w:t>
+                <w:bCs w:val="0"/>
+              </w:rPr>
+              <w:t>1.5</w:t>
             </w:r>
           </w:p>
         </w:tc>
@@ -1291,7 +1221,7 @@
               <w:cnfStyle w:val="000000100000" w:firstRow="0" w:lastRow="0" w:firstColumn="0" w:lastColumn="0" w:oddVBand="0" w:evenVBand="0" w:oddHBand="1" w:evenHBand="0" w:firstRowFirstColumn="0" w:firstRowLastColumn="0" w:lastRowFirstColumn="0" w:lastRowLastColumn="0"/>
             </w:pPr>
             <w:r>
-              <w:t>Nov.2016</w:t>
+              <w:t>Oct.2020</w:t>
             </w:r>
           </w:p>
         </w:tc>
@@ -1305,7 +1235,25 @@
               <w:cnfStyle w:val="000000100000" w:firstRow="0" w:lastRow="0" w:firstColumn="0" w:lastColumn="0" w:oddVBand="0" w:evenVBand="0" w:oddHBand="1" w:evenHBand="0" w:firstRowFirstColumn="0" w:firstRowLastColumn="0" w:lastRowFirstColumn="0" w:lastRowLastColumn="0"/>
             </w:pPr>
             <w:r>
-              <w:t>Added tidal damping for use in multi-channel element models</w:t>
+              <w:t xml:space="preserve">Added inlet model. See Section </w:t>
+            </w:r>
+            <w:r>
+              <w:fldChar w:fldCharType="begin"/>
+            </w:r>
+            <w:r>
+              <w:instrText xml:space="preserve"> REF _Ref53422643 \r \h </w:instrText>
+            </w:r>
+            <w:r>
+              <w:fldChar w:fldCharType="separate"/>
+            </w:r>
+            <w:r>
+              <w:t>3.5</w:t>
+            </w:r>
+            <w:r>
+              <w:fldChar w:fldCharType="end"/>
+            </w:r>
+            <w:r>
+              <w:t>.</w:t>
             </w:r>
           </w:p>
           <w:p>
@@ -1314,7 +1262,43 @@
               <w:cnfStyle w:val="000000100000" w:firstRow="0" w:lastRow="0" w:firstColumn="0" w:lastColumn="0" w:oddVBand="0" w:evenVBand="0" w:oddHBand="1" w:evenHBand="0" w:firstRowFirstColumn="0" w:firstRowLastColumn="0" w:lastRowFirstColumn="0" w:lastRowLastColumn="0"/>
             </w:pPr>
             <w:r>
-              <w:t>Added pan and zoom options to graph tabs</w:t>
+              <w:t xml:space="preserve">Added option to define element specific equilibrium volume using tidal range rather than tidal prism. See Sections </w:t>
+            </w:r>
+            <w:r>
+              <w:fldChar w:fldCharType="begin"/>
+            </w:r>
+            <w:r>
+              <w:instrText xml:space="preserve"> REF _Ref83058435 \r \h </w:instrText>
+            </w:r>
+            <w:r>
+              <w:fldChar w:fldCharType="separate"/>
+            </w:r>
+            <w:r>
+              <w:t>5.4</w:t>
+            </w:r>
+            <w:r>
+              <w:fldChar w:fldCharType="end"/>
+            </w:r>
+            <w:r>
+              <w:t xml:space="preserve"> and </w:t>
+            </w:r>
+            <w:r>
+              <w:fldChar w:fldCharType="begin"/>
+            </w:r>
+            <w:r>
+              <w:instrText xml:space="preserve"> REF _Ref458860700 \r \h </w:instrText>
+            </w:r>
+            <w:r>
+              <w:fldChar w:fldCharType="separate"/>
+            </w:r>
+            <w:r>
+              <w:t>6.1</w:t>
+            </w:r>
+            <w:r>
+              <w:fldChar w:fldCharType="end"/>
+            </w:r>
+            <w:r>
+              <w:t>.</w:t>
             </w:r>
           </w:p>
           <w:p>
@@ -1323,151 +1307,7 @@
               <w:cnfStyle w:val="000000100000" w:firstRow="0" w:lastRow="0" w:firstColumn="0" w:lastColumn="0" w:oddVBand="0" w:evenVBand="0" w:oddHBand="1" w:evenHBand="0" w:firstRowFirstColumn="0" w:firstRowLastColumn="0" w:lastRowFirstColumn="0" w:lastRowLastColumn="0"/>
             </w:pPr>
             <w:r>
-              <w:t>Fixed bug in upstream prism when channels are in random order</w:t>
-            </w:r>
-          </w:p>
-          <w:p>
-            <w:pPr>
-              <w:snapToGrid w:val="0"/>
-              <w:cnfStyle w:val="000000100000" w:firstRow="0" w:lastRow="0" w:firstColumn="0" w:lastColumn="0" w:oddVBand="0" w:evenVBand="0" w:oddHBand="1" w:evenHBand="0" w:firstRowFirstColumn="0" w:firstRowLastColumn="0" w:lastRowFirstColumn="0" w:lastRowLastColumn="0"/>
-            </w:pPr>
-            <w:r>
-              <w:t xml:space="preserve">Element Types extended to allow deltas and beach/spit complexes to be modelled. See Section </w:t>
-            </w:r>
-            <w:r>
-              <w:fldChar w:fldCharType="begin"/>
-            </w:r>
-            <w:r>
-              <w:instrText xml:space="preserve"> REF _Ref459488676 \r \h </w:instrText>
-            </w:r>
-            <w:r>
-              <w:fldChar w:fldCharType="separate"/>
-            </w:r>
-            <w:r>
-              <w:t>5.1</w:t>
-            </w:r>
-            <w:r>
-              <w:fldChar w:fldCharType="end"/>
-            </w:r>
-            <w:r>
-              <w:t>.</w:t>
-            </w:r>
-          </w:p>
-          <w:p>
-            <w:pPr>
-              <w:snapToGrid w:val="0"/>
-              <w:cnfStyle w:val="000000100000" w:firstRow="0" w:lastRow="0" w:firstColumn="0" w:lastColumn="0" w:oddVBand="0" w:evenVBand="0" w:oddHBand="1" w:evenHBand="0" w:firstRowFirstColumn="0" w:firstRowLastColumn="0" w:lastRowFirstColumn="0" w:lastRowLastColumn="0"/>
-            </w:pPr>
-            <w:r>
-              <w:t xml:space="preserve">Added ‘Animate’ tab to plot GUI, to provide animations of how some variable changes across the network. </w:t>
-            </w:r>
-          </w:p>
-          <w:p>
-            <w:pPr>
-              <w:snapToGrid w:val="0"/>
-              <w:cnfStyle w:val="000000100000" w:firstRow="0" w:lastRow="0" w:firstColumn="0" w:lastColumn="0" w:oddVBand="0" w:evenVBand="0" w:oddHBand="1" w:evenHBand="0" w:firstRowFirstColumn="0" w:firstRowLastColumn="0" w:lastRowFirstColumn="0" w:lastRowLastColumn="0"/>
-            </w:pPr>
-            <w:r>
-              <w:t xml:space="preserve">Option to load interventions from a file. See Section </w:t>
-            </w:r>
-            <w:r>
-              <w:fldChar w:fldCharType="begin"/>
-            </w:r>
-            <w:r>
-              <w:instrText xml:space="preserve"> REF _Ref459627191 \r \h </w:instrText>
-            </w:r>
-            <w:r>
-              <w:fldChar w:fldCharType="separate"/>
-            </w:r>
-            <w:r>
-              <w:t>4.4</w:t>
-            </w:r>
-            <w:r>
-              <w:fldChar w:fldCharType="end"/>
-            </w:r>
-          </w:p>
-          <w:p>
-            <w:pPr>
-              <w:snapToGrid w:val="0"/>
-              <w:cnfStyle w:val="000000100000" w:firstRow="0" w:lastRow="0" w:firstColumn="0" w:lastColumn="0" w:oddVBand="0" w:evenVBand="0" w:oddHBand="1" w:evenHBand="0" w:firstRowFirstColumn="0" w:firstRowLastColumn="0" w:lastRowFirstColumn="0" w:lastRowLastColumn="0"/>
-            </w:pPr>
-            <w:r>
-              <w:t xml:space="preserve">Option to load element </w:t>
-            </w:r>
-            <w:r>
-              <w:t>parameters</w:t>
-            </w:r>
-            <w:r>
-              <w:t xml:space="preserve"> from a file. See Section </w:t>
-            </w:r>
-            <w:r>
-              <w:fldChar w:fldCharType="begin"/>
-            </w:r>
-            <w:r>
-              <w:instrText xml:space="preserve"> REF _Ref459627191 \r \h </w:instrText>
-            </w:r>
-            <w:r>
-              <w:fldChar w:fldCharType="separate"/>
-            </w:r>
-            <w:r>
-              <w:t>4.4</w:t>
-            </w:r>
-            <w:r>
-              <w:fldChar w:fldCharType="end"/>
-            </w:r>
-          </w:p>
-          <w:p>
-            <w:pPr>
-              <w:snapToGrid w:val="0"/>
-              <w:cnfStyle w:val="000000100000" w:firstRow="0" w:lastRow="0" w:firstColumn="0" w:lastColumn="0" w:oddVBand="0" w:evenVBand="0" w:oddHBand="1" w:evenHBand="0" w:firstRowFirstColumn="0" w:firstRowLastColumn="0" w:lastRowFirstColumn="0" w:lastRowLastColumn="0"/>
-            </w:pPr>
-            <w:r>
-              <w:t xml:space="preserve">Option to include timeseries definition of river and drift sources. See Sections </w:t>
-            </w:r>
-            <w:r>
-              <w:fldChar w:fldCharType="begin"/>
-            </w:r>
-            <w:r>
-              <w:instrText xml:space="preserve"> REF _Ref459627191 \r \h </w:instrText>
-            </w:r>
-            <w:r>
-              <w:fldChar w:fldCharType="separate"/>
-            </w:r>
-            <w:r>
-              <w:t>4.4</w:t>
-            </w:r>
-            <w:r>
-              <w:fldChar w:fldCharType="end"/>
-            </w:r>
-            <w:r>
-              <w:t xml:space="preserve"> and </w:t>
-            </w:r>
-            <w:r>
-              <w:fldChar w:fldCharType="begin"/>
-            </w:r>
-            <w:r>
-              <w:instrText xml:space="preserve"> REF _Ref463095601 \r \h </w:instrText>
-            </w:r>
-            <w:r>
-              <w:fldChar w:fldCharType="separate"/>
-            </w:r>
-            <w:r>
-              <w:t>5.3</w:t>
-            </w:r>
-            <w:r>
-              <w:fldChar w:fldCharType="end"/>
-            </w:r>
-            <w:r>
-              <w:t>.</w:t>
-            </w:r>
-          </w:p>
-          <w:p>
-            <w:pPr>
-              <w:snapToGrid w:val="0"/>
-              <w:cnfStyle w:val="000000100000" w:firstRow="0" w:lastRow="0" w:firstColumn="0" w:lastColumn="0" w:oddVBand="0" w:evenVBand="0" w:oddHBand="1" w:evenHBand="0" w:firstRowFirstColumn="0" w:firstRowLastColumn="0" w:lastRowFirstColumn="0" w:lastRowLastColumn="0"/>
-            </w:pPr>
-            <w:r>
-              <w:t>Deletion of River and Drift input sources corrected.</w:t>
+              <w:t xml:space="preserve">Updated Unit Testing tools. </w:t>
             </w:r>
           </w:p>
         </w:tc>
@@ -1490,7 +1330,7 @@
               <w:rPr>
                 <w:b w:val="0"/>
               </w:rPr>
-              <w:t>1.3</w:t>
+              <w:t>1.4</w:t>
             </w:r>
           </w:p>
         </w:tc>
@@ -1505,7 +1345,7 @@
               <w:cnfStyle w:val="000000000000" w:firstRow="0" w:lastRow="0" w:firstColumn="0" w:lastColumn="0" w:oddVBand="0" w:evenVBand="0" w:oddHBand="0" w:evenHBand="0" w:firstRowFirstColumn="0" w:firstRowLastColumn="0" w:lastRowFirstColumn="0" w:lastRowLastColumn="0"/>
             </w:pPr>
             <w:r>
-              <w:t>Sep.2016</w:t>
+              <w:t>Nov.2016</w:t>
             </w:r>
           </w:p>
         </w:tc>
@@ -1517,6 +1357,223 @@
             <w:pPr>
               <w:snapToGrid w:val="0"/>
               <w:cnfStyle w:val="000000000000" w:firstRow="0" w:lastRow="0" w:firstColumn="0" w:lastColumn="0" w:oddVBand="0" w:evenVBand="0" w:oddHBand="0" w:evenHBand="0" w:firstRowFirstColumn="0" w:firstRowLastColumn="0" w:lastRowFirstColumn="0" w:lastRowLastColumn="0"/>
+            </w:pPr>
+            <w:r>
+              <w:t>Added tidal damping for use in multi-channel element models</w:t>
+            </w:r>
+          </w:p>
+          <w:p>
+            <w:pPr>
+              <w:snapToGrid w:val="0"/>
+              <w:cnfStyle w:val="000000000000" w:firstRow="0" w:lastRow="0" w:firstColumn="0" w:lastColumn="0" w:oddVBand="0" w:evenVBand="0" w:oddHBand="0" w:evenHBand="0" w:firstRowFirstColumn="0" w:firstRowLastColumn="0" w:lastRowFirstColumn="0" w:lastRowLastColumn="0"/>
+            </w:pPr>
+            <w:r>
+              <w:t>Added pan and zoom options to graph tabs</w:t>
+            </w:r>
+          </w:p>
+          <w:p>
+            <w:pPr>
+              <w:snapToGrid w:val="0"/>
+              <w:cnfStyle w:val="000000000000" w:firstRow="0" w:lastRow="0" w:firstColumn="0" w:lastColumn="0" w:oddVBand="0" w:evenVBand="0" w:oddHBand="0" w:evenHBand="0" w:firstRowFirstColumn="0" w:firstRowLastColumn="0" w:lastRowFirstColumn="0" w:lastRowLastColumn="0"/>
+            </w:pPr>
+            <w:r>
+              <w:t>Fixed bug in upstream prism when channels are in random order</w:t>
+            </w:r>
+          </w:p>
+          <w:p>
+            <w:pPr>
+              <w:snapToGrid w:val="0"/>
+              <w:cnfStyle w:val="000000000000" w:firstRow="0" w:lastRow="0" w:firstColumn="0" w:lastColumn="0" w:oddVBand="0" w:evenVBand="0" w:oddHBand="0" w:evenHBand="0" w:firstRowFirstColumn="0" w:firstRowLastColumn="0" w:lastRowFirstColumn="0" w:lastRowLastColumn="0"/>
+            </w:pPr>
+            <w:r>
+              <w:t xml:space="preserve">Element Types extended to allow deltas and beach/spit complexes to be modelled. See Section </w:t>
+            </w:r>
+            <w:r>
+              <w:fldChar w:fldCharType="begin"/>
+            </w:r>
+            <w:r>
+              <w:instrText xml:space="preserve"> REF _Ref459488676 \r \h </w:instrText>
+            </w:r>
+            <w:r>
+              <w:fldChar w:fldCharType="separate"/>
+            </w:r>
+            <w:r>
+              <w:t>5.1</w:t>
+            </w:r>
+            <w:r>
+              <w:fldChar w:fldCharType="end"/>
+            </w:r>
+            <w:r>
+              <w:t>.</w:t>
+            </w:r>
+          </w:p>
+          <w:p>
+            <w:pPr>
+              <w:snapToGrid w:val="0"/>
+              <w:cnfStyle w:val="000000000000" w:firstRow="0" w:lastRow="0" w:firstColumn="0" w:lastColumn="0" w:oddVBand="0" w:evenVBand="0" w:oddHBand="0" w:evenHBand="0" w:firstRowFirstColumn="0" w:firstRowLastColumn="0" w:lastRowFirstColumn="0" w:lastRowLastColumn="0"/>
+            </w:pPr>
+            <w:r>
+              <w:t xml:space="preserve">Added ‘Animate’ tab to plot GUI, to provide animations of how some variable changes across the network. </w:t>
+            </w:r>
+          </w:p>
+          <w:p>
+            <w:pPr>
+              <w:snapToGrid w:val="0"/>
+              <w:cnfStyle w:val="000000000000" w:firstRow="0" w:lastRow="0" w:firstColumn="0" w:lastColumn="0" w:oddVBand="0" w:evenVBand="0" w:oddHBand="0" w:evenHBand="0" w:firstRowFirstColumn="0" w:firstRowLastColumn="0" w:lastRowFirstColumn="0" w:lastRowLastColumn="0"/>
+            </w:pPr>
+            <w:r>
+              <w:t xml:space="preserve">Option to load interventions from a file. See Section </w:t>
+            </w:r>
+            <w:r>
+              <w:fldChar w:fldCharType="begin"/>
+            </w:r>
+            <w:r>
+              <w:instrText xml:space="preserve"> REF _Ref459627191 \r \h </w:instrText>
+            </w:r>
+            <w:r>
+              <w:fldChar w:fldCharType="separate"/>
+            </w:r>
+            <w:r>
+              <w:t>4.4</w:t>
+            </w:r>
+            <w:r>
+              <w:fldChar w:fldCharType="end"/>
+            </w:r>
+          </w:p>
+          <w:p>
+            <w:pPr>
+              <w:snapToGrid w:val="0"/>
+              <w:cnfStyle w:val="000000000000" w:firstRow="0" w:lastRow="0" w:firstColumn="0" w:lastColumn="0" w:oddVBand="0" w:evenVBand="0" w:oddHBand="0" w:evenHBand="0" w:firstRowFirstColumn="0" w:firstRowLastColumn="0" w:lastRowFirstColumn="0" w:lastRowLastColumn="0"/>
+            </w:pPr>
+            <w:r>
+              <w:t xml:space="preserve">Option to load element </w:t>
+            </w:r>
+            <w:r>
+              <w:t>parameters</w:t>
+            </w:r>
+            <w:r>
+              <w:t xml:space="preserve"> from a file. See Section </w:t>
+            </w:r>
+            <w:r>
+              <w:fldChar w:fldCharType="begin"/>
+            </w:r>
+            <w:r>
+              <w:instrText xml:space="preserve"> REF _Ref459627191 \r \h </w:instrText>
+            </w:r>
+            <w:r>
+              <w:fldChar w:fldCharType="separate"/>
+            </w:r>
+            <w:r>
+              <w:t>4.4</w:t>
+            </w:r>
+            <w:r>
+              <w:fldChar w:fldCharType="end"/>
+            </w:r>
+          </w:p>
+          <w:p>
+            <w:pPr>
+              <w:snapToGrid w:val="0"/>
+              <w:cnfStyle w:val="000000000000" w:firstRow="0" w:lastRow="0" w:firstColumn="0" w:lastColumn="0" w:oddVBand="0" w:evenVBand="0" w:oddHBand="0" w:evenHBand="0" w:firstRowFirstColumn="0" w:firstRowLastColumn="0" w:lastRowFirstColumn="0" w:lastRowLastColumn="0"/>
+            </w:pPr>
+            <w:r>
+              <w:t xml:space="preserve">Option to include timeseries definition of river and drift sources. See Sections </w:t>
+            </w:r>
+            <w:r>
+              <w:fldChar w:fldCharType="begin"/>
+            </w:r>
+            <w:r>
+              <w:instrText xml:space="preserve"> REF _Ref459627191 \r \h </w:instrText>
+            </w:r>
+            <w:r>
+              <w:fldChar w:fldCharType="separate"/>
+            </w:r>
+            <w:r>
+              <w:t>4.4</w:t>
+            </w:r>
+            <w:r>
+              <w:fldChar w:fldCharType="end"/>
+            </w:r>
+            <w:r>
+              <w:t xml:space="preserve"> and </w:t>
+            </w:r>
+            <w:r>
+              <w:fldChar w:fldCharType="begin"/>
+            </w:r>
+            <w:r>
+              <w:instrText xml:space="preserve"> REF _Ref463095601 \r \h </w:instrText>
+            </w:r>
+            <w:r>
+              <w:fldChar w:fldCharType="separate"/>
+            </w:r>
+            <w:r>
+              <w:t>5.3</w:t>
+            </w:r>
+            <w:r>
+              <w:fldChar w:fldCharType="end"/>
+            </w:r>
+            <w:r>
+              <w:t>.</w:t>
+            </w:r>
+          </w:p>
+          <w:p>
+            <w:pPr>
+              <w:snapToGrid w:val="0"/>
+              <w:cnfStyle w:val="000000000000" w:firstRow="0" w:lastRow="0" w:firstColumn="0" w:lastColumn="0" w:oddVBand="0" w:evenVBand="0" w:oddHBand="0" w:evenHBand="0" w:firstRowFirstColumn="0" w:firstRowLastColumn="0" w:lastRowFirstColumn="0" w:lastRowLastColumn="0"/>
+            </w:pPr>
+            <w:r>
+              <w:t>Deletion of River and Drift input sources corrected.</w:t>
+            </w:r>
+          </w:p>
+        </w:tc>
+      </w:tr>
+      <w:tr>
+        <w:trPr>
+          <w:cnfStyle w:val="000000100000" w:firstRow="0" w:lastRow="0" w:firstColumn="0" w:lastColumn="0" w:oddVBand="0" w:evenVBand="0" w:oddHBand="1" w:evenHBand="0" w:firstRowFirstColumn="0" w:firstRowLastColumn="0" w:lastRowFirstColumn="0" w:lastRowLastColumn="0"/>
+        </w:trPr>
+        <w:tc>
+          <w:tcPr>
+            <w:cnfStyle w:val="001000000000" w:firstRow="0" w:lastRow="0" w:firstColumn="1" w:lastColumn="0" w:oddVBand="0" w:evenVBand="0" w:oddHBand="0" w:evenHBand="0" w:firstRowFirstColumn="0" w:firstRowLastColumn="0" w:lastRowFirstColumn="0" w:lastRowLastColumn="0"/>
+            <w:tcW w:w="1273" w:type="dxa"/>
+          </w:tcPr>
+          <w:p>
+            <w:pPr>
+              <w:snapToGrid w:val="0"/>
+              <w:jc w:val="center"/>
+              <w:rPr>
+                <w:b w:val="0"/>
+              </w:rPr>
+            </w:pPr>
+            <w:r>
+              <w:rPr>
+                <w:b w:val="0"/>
+              </w:rPr>
+              <w:t>1.3</w:t>
+            </w:r>
+          </w:p>
+        </w:tc>
+        <w:tc>
+          <w:tcPr>
+            <w:tcW w:w="1274" w:type="dxa"/>
+          </w:tcPr>
+          <w:p>
+            <w:pPr>
+              <w:snapToGrid w:val="0"/>
+              <w:jc w:val="center"/>
+              <w:cnfStyle w:val="000000100000" w:firstRow="0" w:lastRow="0" w:firstColumn="0" w:lastColumn="0" w:oddVBand="0" w:evenVBand="0" w:oddHBand="1" w:evenHBand="0" w:firstRowFirstColumn="0" w:firstRowLastColumn="0" w:lastRowFirstColumn="0" w:lastRowLastColumn="0"/>
+            </w:pPr>
+            <w:r>
+              <w:t>Sep.2016</w:t>
+            </w:r>
+          </w:p>
+        </w:tc>
+        <w:tc>
+          <w:tcPr>
+            <w:tcW w:w="6513" w:type="dxa"/>
+          </w:tcPr>
+          <w:p>
+            <w:pPr>
+              <w:snapToGrid w:val="0"/>
+              <w:cnfStyle w:val="000000100000" w:firstRow="0" w:lastRow="0" w:firstColumn="0" w:lastColumn="0" w:oddVBand="0" w:evenVBand="0" w:oddHBand="1" w:evenHBand="0" w:firstRowFirstColumn="0" w:firstRowLastColumn="0" w:lastRowFirstColumn="0" w:lastRowLastColumn="0"/>
             </w:pPr>
             <w:r>
               <w:t>First release to accompany papers published in China Ocean Engineering</w:t>
@@ -8317,7 +8374,7 @@
             <v:imagedata r:id="rId13" o:title=""/>
             <w10:wrap type="topAndBottom" side="left"/>
           </v:shape>
-          <o:OLEObject Type="Embed" ProgID="Visio.Drawing.11" ShapeID="_x0000_s2050" DrawAspect="Content" ObjectID="_1839308238" r:id="rId14"/>
+          <o:OLEObject Type="Embed" ProgID="Visio.Drawing.11" ShapeID="_x0000_s2050" DrawAspect="Content" ObjectID="_1839310781" r:id="rId14"/>
         </w:object>
       </w:r>
       <w:r>
@@ -10642,7 +10699,7 @@
           <w:noProof/>
         </w:rPr>
         <w:drawing>
-          <wp:anchor distT="0" distB="0" distL="114300" distR="114300" simplePos="0" relativeHeight="251786240" behindDoc="0" locked="0" layoutInCell="1" allowOverlap="1" wp14:anchorId="02DB6950" wp14:editId="13AB1F3E">
+          <wp:anchor distT="0" distB="0" distL="114300" distR="114300" simplePos="0" relativeHeight="251786240" behindDoc="0" locked="0" layoutInCell="1" allowOverlap="1" wp14:anchorId="02DB6950" wp14:editId="2536E86E">
             <wp:simplePos x="0" y="0"/>
             <wp:positionH relativeFrom="column">
               <wp:posOffset>4406265</wp:posOffset>
@@ -12797,7 +12854,7 @@
         </w:rPr>
         <w:lastRenderedPageBreak/>
         <w:drawing>
-          <wp:anchor distT="0" distB="0" distL="114300" distR="114300" simplePos="0" relativeHeight="251789312" behindDoc="0" locked="0" layoutInCell="1" allowOverlap="1" wp14:anchorId="2C71BBD5" wp14:editId="5009666C">
+          <wp:anchor distT="0" distB="0" distL="114300" distR="114300" simplePos="0" relativeHeight="251789312" behindDoc="0" locked="0" layoutInCell="1" allowOverlap="1" wp14:anchorId="2C71BBD5" wp14:editId="01EABBE5">
             <wp:simplePos x="0" y="0"/>
             <wp:positionH relativeFrom="margin">
               <wp:posOffset>4450715</wp:posOffset>
@@ -14550,7 +14607,7 @@
                 <w:noProof/>
               </w:rPr>
               <w:drawing>
-                <wp:inline distT="0" distB="0" distL="0" distR="0" wp14:anchorId="2A1D5C21" wp14:editId="0ABB571B">
+                <wp:inline distT="0" distB="0" distL="0" distR="0" wp14:anchorId="2A1D5C21" wp14:editId="4133F92B">
                   <wp:extent cx="3020695" cy="2350770"/>
                   <wp:effectExtent l="0" t="0" r="8255" b="0"/>
                   <wp:docPr id="53" name="Picture 53" descr="Chart, histogram&#10;&#10;Description automatically generated"/>
@@ -16162,7 +16219,7 @@
           <w:noProof/>
         </w:rPr>
         <w:drawing>
-          <wp:anchor distT="0" distB="0" distL="114300" distR="114300" simplePos="0" relativeHeight="251791360" behindDoc="0" locked="0" layoutInCell="1" allowOverlap="1" wp14:anchorId="46267971" wp14:editId="0E69C51B">
+          <wp:anchor distT="0" distB="0" distL="114300" distR="114300" simplePos="0" relativeHeight="251791360" behindDoc="0" locked="0" layoutInCell="1" allowOverlap="1" wp14:anchorId="46267971" wp14:editId="262DAC33">
             <wp:simplePos x="0" y="0"/>
             <wp:positionH relativeFrom="margin">
               <wp:align>left</wp:align>
@@ -16606,7 +16663,7 @@
           <w:noProof/>
         </w:rPr>
         <w:drawing>
-          <wp:anchor distT="0" distB="0" distL="114300" distR="114300" simplePos="0" relativeHeight="251741184" behindDoc="0" locked="0" layoutInCell="1" allowOverlap="1" wp14:anchorId="00FCB62E" wp14:editId="16AD38D3">
+          <wp:anchor distT="0" distB="0" distL="114300" distR="114300" simplePos="0" relativeHeight="251741184" behindDoc="0" locked="0" layoutInCell="1" allowOverlap="1" wp14:anchorId="00FCB62E" wp14:editId="791B44DC">
             <wp:simplePos x="0" y="0"/>
             <wp:positionH relativeFrom="column">
               <wp:posOffset>-81280</wp:posOffset>
@@ -17079,7 +17136,7 @@
           <w:noProof/>
         </w:rPr>
         <w:drawing>
-          <wp:anchor distT="0" distB="0" distL="114300" distR="114300" simplePos="0" relativeHeight="251796480" behindDoc="0" locked="0" layoutInCell="1" allowOverlap="1" wp14:anchorId="258E005B" wp14:editId="09EAFB09">
+          <wp:anchor distT="0" distB="0" distL="114300" distR="114300" simplePos="0" relativeHeight="251796480" behindDoc="0" locked="0" layoutInCell="1" allowOverlap="1" wp14:anchorId="258E005B" wp14:editId="147C216E">
             <wp:simplePos x="0" y="0"/>
             <wp:positionH relativeFrom="column">
               <wp:posOffset>29845</wp:posOffset>
@@ -17141,7 +17198,7 @@
           <w:noProof/>
         </w:rPr>
         <w:drawing>
-          <wp:anchor distT="0" distB="0" distL="114300" distR="114300" simplePos="0" relativeHeight="251795456" behindDoc="0" locked="0" layoutInCell="1" allowOverlap="1" wp14:anchorId="32C30B9A" wp14:editId="09C5F23E">
+          <wp:anchor distT="0" distB="0" distL="114300" distR="114300" simplePos="0" relativeHeight="251795456" behindDoc="0" locked="0" layoutInCell="1" allowOverlap="1" wp14:anchorId="32C30B9A" wp14:editId="723C75B2">
             <wp:simplePos x="0" y="0"/>
             <wp:positionH relativeFrom="margin">
               <wp:align>right</wp:align>
@@ -17796,7 +17853,7 @@
           <w:noProof/>
         </w:rPr>
         <w:drawing>
-          <wp:anchor distT="0" distB="0" distL="114300" distR="114300" simplePos="0" relativeHeight="251801600" behindDoc="0" locked="0" layoutInCell="1" allowOverlap="1" wp14:anchorId="7A2AF236" wp14:editId="21530A7C">
+          <wp:anchor distT="0" distB="0" distL="114300" distR="114300" simplePos="0" relativeHeight="251801600" behindDoc="0" locked="0" layoutInCell="1" allowOverlap="1" wp14:anchorId="7A2AF236" wp14:editId="06227057">
             <wp:simplePos x="0" y="0"/>
             <wp:positionH relativeFrom="column">
               <wp:posOffset>-33293</wp:posOffset>
@@ -17867,7 +17924,7 @@
         </w:rPr>
         <w:lastRenderedPageBreak/>
         <w:drawing>
-          <wp:anchor distT="0" distB="0" distL="114300" distR="114300" simplePos="0" relativeHeight="251817984" behindDoc="0" locked="0" layoutInCell="1" allowOverlap="1" wp14:anchorId="2495D4E1" wp14:editId="2409A6DC">
+          <wp:anchor distT="0" distB="0" distL="114300" distR="114300" simplePos="0" relativeHeight="251817984" behindDoc="0" locked="0" layoutInCell="1" allowOverlap="1" wp14:anchorId="2495D4E1" wp14:editId="55E67BA6">
             <wp:simplePos x="0" y="0"/>
             <wp:positionH relativeFrom="margin">
               <wp:align>right</wp:align>
@@ -18093,7 +18150,7 @@
           <w:noProof/>
         </w:rPr>
         <w:drawing>
-          <wp:anchor distT="0" distB="0" distL="114300" distR="114300" simplePos="0" relativeHeight="251819008" behindDoc="0" locked="0" layoutInCell="1" allowOverlap="1" wp14:anchorId="0525CC7A" wp14:editId="7A7CE27C">
+          <wp:anchor distT="0" distB="0" distL="114300" distR="114300" simplePos="0" relativeHeight="251819008" behindDoc="0" locked="0" layoutInCell="1" allowOverlap="1" wp14:anchorId="0525CC7A" wp14:editId="2F7C7D7A">
             <wp:simplePos x="0" y="0"/>
             <wp:positionH relativeFrom="margin">
               <wp:align>right</wp:align>
@@ -18447,7 +18504,7 @@
           <w:noProof/>
         </w:rPr>
         <w:drawing>
-          <wp:anchor distT="0" distB="0" distL="114300" distR="114300" simplePos="0" relativeHeight="251810816" behindDoc="0" locked="0" layoutInCell="1" allowOverlap="1" wp14:anchorId="1F6CC7E3" wp14:editId="6CEDD121">
+          <wp:anchor distT="0" distB="0" distL="114300" distR="114300" simplePos="0" relativeHeight="251810816" behindDoc="0" locked="0" layoutInCell="1" allowOverlap="1" wp14:anchorId="1F6CC7E3" wp14:editId="24501684">
             <wp:simplePos x="0" y="0"/>
             <wp:positionH relativeFrom="margin">
               <wp:align>right</wp:align>
@@ -20730,7 +20787,7 @@
           <w:noProof/>
         </w:rPr>
         <w:drawing>
-          <wp:anchor distT="0" distB="0" distL="114300" distR="114300" simplePos="0" relativeHeight="251785216" behindDoc="0" locked="0" layoutInCell="1" allowOverlap="1" wp14:anchorId="2C6C941E" wp14:editId="3FC4689B">
+          <wp:anchor distT="0" distB="0" distL="114300" distR="114300" simplePos="0" relativeHeight="251785216" behindDoc="0" locked="0" layoutInCell="1" allowOverlap="1" wp14:anchorId="2C6C941E" wp14:editId="5F88F5F1">
             <wp:simplePos x="0" y="0"/>
             <wp:positionH relativeFrom="margin">
               <wp:align>right</wp:align>
@@ -24072,7 +24129,7 @@
           <w:noProof/>
         </w:rPr>
         <w:drawing>
-          <wp:anchor distT="0" distB="0" distL="114300" distR="114300" simplePos="0" relativeHeight="251772928" behindDoc="0" locked="0" layoutInCell="1" allowOverlap="1" wp14:anchorId="561AD9AD" wp14:editId="67F5121A">
+          <wp:anchor distT="0" distB="0" distL="114300" distR="114300" simplePos="0" relativeHeight="251772928" behindDoc="0" locked="0" layoutInCell="1" allowOverlap="1" wp14:anchorId="561AD9AD" wp14:editId="009B43E9">
             <wp:simplePos x="0" y="0"/>
             <wp:positionH relativeFrom="column">
               <wp:posOffset>31750</wp:posOffset>
@@ -24468,7 +24525,7 @@
           <w:noProof/>
         </w:rPr>
         <w:drawing>
-          <wp:anchor distT="0" distB="0" distL="114300" distR="114300" simplePos="0" relativeHeight="251779072" behindDoc="0" locked="0" layoutInCell="1" allowOverlap="1" wp14:anchorId="3F78D689" wp14:editId="7EDFBA25">
+          <wp:anchor distT="0" distB="0" distL="114300" distR="114300" simplePos="0" relativeHeight="251779072" behindDoc="0" locked="0" layoutInCell="1" allowOverlap="1" wp14:anchorId="3F78D689" wp14:editId="5A761F4A">
             <wp:simplePos x="0" y="0"/>
             <wp:positionH relativeFrom="margin">
               <wp:align>left</wp:align>
@@ -25877,7 +25934,7 @@
           <w:noProof/>
         </w:rPr>
         <w:drawing>
-          <wp:anchor distT="0" distB="0" distL="114300" distR="114300" simplePos="0" relativeHeight="251773952" behindDoc="0" locked="0" layoutInCell="1" allowOverlap="1" wp14:anchorId="22FC696B" wp14:editId="28848499">
+          <wp:anchor distT="0" distB="0" distL="114300" distR="114300" simplePos="0" relativeHeight="251773952" behindDoc="0" locked="0" layoutInCell="1" allowOverlap="1" wp14:anchorId="22FC696B" wp14:editId="08059D74">
             <wp:simplePos x="0" y="0"/>
             <wp:positionH relativeFrom="column">
               <wp:posOffset>-52387</wp:posOffset>
@@ -25971,7 +26028,7 @@
           <w:noProof/>
         </w:rPr>
         <w:drawing>
-          <wp:anchor distT="0" distB="0" distL="114300" distR="114300" simplePos="0" relativeHeight="251774976" behindDoc="0" locked="0" layoutInCell="1" allowOverlap="1" wp14:anchorId="63116EE3" wp14:editId="4F847B8C">
+          <wp:anchor distT="0" distB="0" distL="114300" distR="114300" simplePos="0" relativeHeight="251774976" behindDoc="0" locked="0" layoutInCell="1" allowOverlap="1" wp14:anchorId="63116EE3" wp14:editId="4061EE74">
             <wp:simplePos x="0" y="0"/>
             <wp:positionH relativeFrom="column">
               <wp:posOffset>-71755</wp:posOffset>
@@ -26058,7 +26115,7 @@
           <w:noProof/>
         </w:rPr>
         <w:drawing>
-          <wp:anchor distT="0" distB="0" distL="114300" distR="114300" simplePos="0" relativeHeight="251776000" behindDoc="0" locked="0" layoutInCell="1" allowOverlap="1" wp14:anchorId="2C87BD03" wp14:editId="6AFEE42D">
+          <wp:anchor distT="0" distB="0" distL="114300" distR="114300" simplePos="0" relativeHeight="251776000" behindDoc="0" locked="0" layoutInCell="1" allowOverlap="1" wp14:anchorId="2C87BD03" wp14:editId="082CF93B">
             <wp:simplePos x="0" y="0"/>
             <wp:positionH relativeFrom="margin">
               <wp:posOffset>-635</wp:posOffset>
@@ -27231,7 +27288,7 @@
           <v:shape id="_x0000_i1026" type="#_x0000_t75" style="width:108.3pt;height:19.35pt" o:ole="">
             <v:imagedata r:id="rId75" o:title=""/>
           </v:shape>
-          <o:OLEObject Type="Embed" ProgID="Equation.DSMT4" ShapeID="_x0000_i1026" DrawAspect="Content" ObjectID="_1839308220" r:id="rId76"/>
+          <o:OLEObject Type="Embed" ProgID="Equation.DSMT4" ShapeID="_x0000_i1026" DrawAspect="Content" ObjectID="_1839310763" r:id="rId76"/>
         </w:object>
       </w:r>
     </w:p>
@@ -27250,7 +27307,7 @@
           <v:shape id="_x0000_i1027" type="#_x0000_t75" style="width:139.65pt;height:19.35pt" o:ole="">
             <v:imagedata r:id="rId77" o:title=""/>
           </v:shape>
-          <o:OLEObject Type="Embed" ProgID="Equation.DSMT4" ShapeID="_x0000_i1027" DrawAspect="Content" ObjectID="_1839308221" r:id="rId78"/>
+          <o:OLEObject Type="Embed" ProgID="Equation.DSMT4" ShapeID="_x0000_i1027" DrawAspect="Content" ObjectID="_1839310764" r:id="rId78"/>
         </w:object>
       </w:r>
     </w:p>
@@ -27270,7 +27327,7 @@
           <v:shape id="_x0000_i1028" type="#_x0000_t75" style="width:108.3pt;height:36.35pt" o:ole="">
             <v:imagedata r:id="rId79" o:title=""/>
           </v:shape>
-          <o:OLEObject Type="Embed" ProgID="Equation.DSMT4" ShapeID="_x0000_i1028" DrawAspect="Content" ObjectID="_1839308222" r:id="rId80"/>
+          <o:OLEObject Type="Embed" ProgID="Equation.DSMT4" ShapeID="_x0000_i1028" DrawAspect="Content" ObjectID="_1839310765" r:id="rId80"/>
         </w:object>
       </w:r>
       <w:r>
@@ -27284,7 +27341,7 @@
           <v:shape id="_x0000_i1029" type="#_x0000_t75" style="width:114.95pt;height:18pt" o:ole="">
             <v:imagedata r:id="rId81" o:title=""/>
           </v:shape>
-          <o:OLEObject Type="Embed" ProgID="Equation.DSMT4" ShapeID="_x0000_i1029" DrawAspect="Content" ObjectID="_1839308223" r:id="rId82"/>
+          <o:OLEObject Type="Embed" ProgID="Equation.DSMT4" ShapeID="_x0000_i1029" DrawAspect="Content" ObjectID="_1839310766" r:id="rId82"/>
         </w:object>
       </w:r>
       <w:r>
@@ -27298,7 +27355,7 @@
           <v:shape id="_x0000_i1030" type="#_x0000_t75" style="width:64.3pt;height:22.35pt" o:ole="">
             <v:imagedata r:id="rId83" o:title=""/>
           </v:shape>
-          <o:OLEObject Type="Embed" ProgID="Equation.DSMT4" ShapeID="_x0000_i1030" DrawAspect="Content" ObjectID="_1839308224" r:id="rId84"/>
+          <o:OLEObject Type="Embed" ProgID="Equation.DSMT4" ShapeID="_x0000_i1030" DrawAspect="Content" ObjectID="_1839310767" r:id="rId84"/>
         </w:object>
       </w:r>
     </w:p>
@@ -27338,7 +27395,7 @@
           <v:shape id="_x0000_i1031" type="#_x0000_t75" style="width:22.65pt;height:19.35pt" o:ole="">
             <v:imagedata r:id="rId85" o:title=""/>
           </v:shape>
-          <o:OLEObject Type="Embed" ProgID="Equation.DSMT4" ShapeID="_x0000_i1031" DrawAspect="Content" ObjectID="_1839308225" r:id="rId86"/>
+          <o:OLEObject Type="Embed" ProgID="Equation.DSMT4" ShapeID="_x0000_i1031" DrawAspect="Content" ObjectID="_1839310768" r:id="rId86"/>
         </w:object>
       </w:r>
       <w:r>
@@ -27352,7 +27409,7 @@
           <v:shape id="_x0000_i1032" type="#_x0000_t75" style="width:22.65pt;height:18pt" o:ole="">
             <v:imagedata r:id="rId87" o:title=""/>
           </v:shape>
-          <o:OLEObject Type="Embed" ProgID="Equation.DSMT4" ShapeID="_x0000_i1032" DrawAspect="Content" ObjectID="_1839308226" r:id="rId88"/>
+          <o:OLEObject Type="Embed" ProgID="Equation.DSMT4" ShapeID="_x0000_i1032" DrawAspect="Content" ObjectID="_1839310769" r:id="rId88"/>
         </w:object>
       </w:r>
       <w:r>
@@ -27367,7 +27424,7 @@
           <v:shape id="_x0000_i1033" type="#_x0000_t75" style="width:138pt;height:22.35pt" o:ole="">
             <v:imagedata r:id="rId89" o:title=""/>
           </v:shape>
-          <o:OLEObject Type="Embed" ProgID="Equation.DSMT4" ShapeID="_x0000_i1033" DrawAspect="Content" ObjectID="_1839308227" r:id="rId90"/>
+          <o:OLEObject Type="Embed" ProgID="Equation.DSMT4" ShapeID="_x0000_i1033" DrawAspect="Content" ObjectID="_1839310770" r:id="rId90"/>
         </w:object>
       </w:r>
       <w:bookmarkEnd w:id="137"/>
@@ -27387,7 +27444,7 @@
           <v:shape id="_x0000_i1034" type="#_x0000_t75" style="width:61.4pt;height:19.35pt" o:ole="">
             <v:imagedata r:id="rId91" o:title=""/>
           </v:shape>
-          <o:OLEObject Type="Embed" ProgID="Equation.DSMT4" ShapeID="_x0000_i1034" DrawAspect="Content" ObjectID="_1839308228" r:id="rId92"/>
+          <o:OLEObject Type="Embed" ProgID="Equation.DSMT4" ShapeID="_x0000_i1034" DrawAspect="Content" ObjectID="_1839310771" r:id="rId92"/>
         </w:object>
       </w:r>
       <w:r>
@@ -27401,7 +27458,7 @@
           <v:shape id="_x0000_i1035" type="#_x0000_t75" style="width:119pt;height:19.35pt" o:ole="">
             <v:imagedata r:id="rId93" o:title=""/>
           </v:shape>
-          <o:OLEObject Type="Embed" ProgID="Equation.DSMT4" ShapeID="_x0000_i1035" DrawAspect="Content" ObjectID="_1839308229" r:id="rId94"/>
+          <o:OLEObject Type="Embed" ProgID="Equation.DSMT4" ShapeID="_x0000_i1035" DrawAspect="Content" ObjectID="_1839310772" r:id="rId94"/>
         </w:object>
       </w:r>
       <w:r>
@@ -29961,7 +30018,7 @@
           <v:shape id="_x0000_i1036" type="#_x0000_t75" style="width:53.35pt;height:34.35pt" o:ole="">
             <v:imagedata r:id="rId95" o:title=""/>
           </v:shape>
-          <o:OLEObject Type="Embed" ProgID="Equation.3" ShapeID="_x0000_i1036" DrawAspect="Content" ObjectID="_1839308230" r:id="rId96"/>
+          <o:OLEObject Type="Embed" ProgID="Equation.3" ShapeID="_x0000_i1036" DrawAspect="Content" ObjectID="_1839310773" r:id="rId96"/>
         </w:object>
       </w:r>
       <w:r>
@@ -30353,7 +30410,7 @@
           <v:shape id="_x0000_i1037" type="#_x0000_t75" style="width:132.95pt;height:22pt" o:ole="">
             <v:imagedata r:id="rId97" o:title=""/>
           </v:shape>
-          <o:OLEObject Type="Embed" ProgID="Equation.DSMT4" ShapeID="_x0000_i1037" DrawAspect="Content" ObjectID="_1839308231" r:id="rId98"/>
+          <o:OLEObject Type="Embed" ProgID="Equation.DSMT4" ShapeID="_x0000_i1037" DrawAspect="Content" ObjectID="_1839310774" r:id="rId98"/>
         </w:object>
       </w:r>
       <w:r>
@@ -31091,7 +31148,7 @@
           <v:shape id="_x0000_i1038" type="#_x0000_t75" style="width:135pt;height:24pt" o:ole="">
             <v:imagedata r:id="rId99" o:title=""/>
           </v:shape>
-          <o:OLEObject Type="Embed" ProgID="Equation.DSMT4" ShapeID="_x0000_i1038" DrawAspect="Content" ObjectID="_1839308232" r:id="rId100"/>
+          <o:OLEObject Type="Embed" ProgID="Equation.DSMT4" ShapeID="_x0000_i1038" DrawAspect="Content" ObjectID="_1839310775" r:id="rId100"/>
         </w:object>
       </w:r>
       <w:r>
@@ -33875,9 +33932,9 @@
       <w:bookmarkEnd w:id="189"/>
       <w:bookmarkEnd w:id="190"/>
     </w:p>
-    <w:p>
-      <w:bookmarkStart w:id="192" w:name="_Hlk53505740"/>
-      <w:bookmarkEnd w:id="191"/>
+    <w:bookmarkStart w:id="192" w:name="_Hlk53505740"/>
+    <w:bookmarkEnd w:id="191"/>
+    <w:p>
       <w:r>
         <w:rPr>
           <w:noProof/>
@@ -40461,7 +40518,7 @@
           <v:shape id="_x0000_i1039" type="#_x0000_t75" style="width:196pt;height:58pt" o:ole="">
             <v:imagedata r:id="rId102" o:title=""/>
           </v:shape>
-          <o:OLEObject Type="Embed" ProgID="Equation.DSMT4" ShapeID="_x0000_i1039" DrawAspect="Content" ObjectID="_1839308233" r:id="rId103"/>
+          <o:OLEObject Type="Embed" ProgID="Equation.DSMT4" ShapeID="_x0000_i1039" DrawAspect="Content" ObjectID="_1839310776" r:id="rId103"/>
         </w:object>
       </w:r>
     </w:p>
@@ -41370,7 +41427,7 @@
           <w:noProof/>
         </w:rPr>
         <w:drawing>
-          <wp:inline distT="0" distB="0" distL="0" distR="0" wp14:anchorId="7D80D3E7" wp14:editId="0E97A76E">
+          <wp:inline distT="0" distB="0" distL="0" distR="0" wp14:anchorId="7D80D3E7" wp14:editId="5188CCFD">
             <wp:extent cx="5722982" cy="2964407"/>
             <wp:effectExtent l="0" t="0" r="0" b="7620"/>
             <wp:docPr id="48" name="Picture 48" descr="Timeline&#10;&#10;Description automatically generated"/>
@@ -43453,7 +43510,7 @@
           <v:shape id="_x0000_i1040" type="#_x0000_t75" style="width:97.3pt;height:40.65pt" o:ole="">
             <v:imagedata r:id="rId114" o:title=""/>
           </v:shape>
-          <o:OLEObject Type="Embed" ProgID="Equation.3" ShapeID="_x0000_i1040" DrawAspect="Content" ObjectID="_1839308234" r:id="rId115"/>
+          <o:OLEObject Type="Embed" ProgID="Equation.3" ShapeID="_x0000_i1040" DrawAspect="Content" ObjectID="_1839310777" r:id="rId115"/>
         </w:object>
       </w:r>
       <w:r>
@@ -43496,7 +43553,7 @@
           <v:shape id="_x0000_i1041" type="#_x0000_t75" style="width:205.65pt;height:40.65pt" o:ole="">
             <v:imagedata r:id="rId116" o:title=""/>
           </v:shape>
-          <o:OLEObject Type="Embed" ProgID="Equation.DSMT4" ShapeID="_x0000_i1041" DrawAspect="Content" ObjectID="_1839308235" r:id="rId117"/>
+          <o:OLEObject Type="Embed" ProgID="Equation.DSMT4" ShapeID="_x0000_i1041" DrawAspect="Content" ObjectID="_1839310778" r:id="rId117"/>
         </w:object>
       </w:r>
       <w:r>
@@ -43594,7 +43651,7 @@
           <v:shape id="_x0000_i1042" type="#_x0000_t75" style="width:217.45pt;height:85pt" o:ole="">
             <v:imagedata r:id="rId118" o:title=""/>
           </v:shape>
-          <o:OLEObject Type="Embed" ProgID="Equation.DSMT4" ShapeID="_x0000_i1042" DrawAspect="Content" ObjectID="_1839308236" r:id="rId119"/>
+          <o:OLEObject Type="Embed" ProgID="Equation.DSMT4" ShapeID="_x0000_i1042" DrawAspect="Content" ObjectID="_1839310779" r:id="rId119"/>
         </w:object>
       </w:r>
       <w:bookmarkEnd w:id="273"/>
@@ -43684,7 +43741,7 @@
           <v:shape id="_x0000_i1043" type="#_x0000_t75" style="width:216.7pt;height:85pt" o:ole="">
             <v:imagedata r:id="rId120" o:title=""/>
           </v:shape>
-          <o:OLEObject Type="Embed" ProgID="Equation.DSMT4" ShapeID="_x0000_i1043" DrawAspect="Content" ObjectID="_1839308237" r:id="rId121"/>
+          <o:OLEObject Type="Embed" ProgID="Equation.DSMT4" ShapeID="_x0000_i1043" DrawAspect="Content" ObjectID="_1839310780" r:id="rId121"/>
         </w:object>
       </w:r>
       <w:bookmarkEnd w:id="274"/>

</xml_diff>